<commit_message>
commit run + readme file
</commit_message>
<xml_diff>
--- a/rapport-multi-guenif-ouadi.docx
+++ b/rapport-multi-guenif-ouadi.docx
@@ -120,7 +120,29 @@
               <w:sz w:val="24"/>
               <w:szCs w:val="24"/>
             </w:rPr>
-            <w:t xml:space="preserve">Module : Systemes </w:t>
+            <w:t xml:space="preserve">Module : </w:t>
+          </w:r>
+          <w:proofErr w:type="spellStart"/>
+          <w:r>
+            <w:rPr>
+              <w:b/>
+              <w:bCs/>
+              <w:color w:val="BDD4EE"/>
+              <w:sz w:val="24"/>
+              <w:szCs w:val="24"/>
+            </w:rPr>
+            <w:t>Systemes</w:t>
+          </w:r>
+          <w:proofErr w:type="spellEnd"/>
+          <w:r>
+            <w:rPr>
+              <w:b/>
+              <w:bCs/>
+              <w:color w:val="BDD4EE"/>
+              <w:sz w:val="24"/>
+              <w:szCs w:val="24"/>
+            </w:rPr>
+            <w:t xml:space="preserve"> </w:t>
           </w:r>
           <w:proofErr w:type="spellStart"/>
           <w:r>
@@ -244,18 +266,7 @@
               <w:sz w:val="42"/>
               <w:szCs w:val="42"/>
             </w:rPr>
-            <w:t xml:space="preserve">Rapport de Mini Projet </w:t>
-          </w:r>
-          <w:r>
-            <w:rPr>
-              <w:rFonts w:ascii="Arial" w:eastAsia="Arial" w:hAnsi="Arial" w:cs="Arial"/>
-              <w:b/>
-              <w:bCs/>
-              <w:color w:val="000000" w:themeColor="text1"/>
-              <w:sz w:val="42"/>
-              <w:szCs w:val="42"/>
-            </w:rPr>
-            <w:t>MultiMedia</w:t>
+            <w:t>Rapport de Mini Projet MultiMedia</w:t>
           </w:r>
           <w:r>
             <w:rPr>
@@ -431,15 +442,7 @@
                                     <w:bCs/>
                                     <w:color w:val="215E99" w:themeColor="text2" w:themeTint="BF"/>
                                   </w:rPr>
-                                  <w:t xml:space="preserve">Groupe / </w:t>
-                                </w:r>
-                                <w:r>
-                                  <w:rPr>
-                                    <w:b/>
-                                    <w:bCs/>
-                                    <w:color w:val="215E99" w:themeColor="text2" w:themeTint="BF"/>
-                                  </w:rPr>
-                                  <w:t>Binôme </w:t>
+                                  <w:t>Groupe / Binôme </w:t>
                                 </w:r>
                                 <w:r>
                                   <w:rPr>
@@ -583,15 +586,7 @@
                               <w:bCs/>
                               <w:color w:val="215E99" w:themeColor="text2" w:themeTint="BF"/>
                             </w:rPr>
-                            <w:t xml:space="preserve">Groupe / </w:t>
-                          </w:r>
-                          <w:r>
-                            <w:rPr>
-                              <w:b/>
-                              <w:bCs/>
-                              <w:color w:val="215E99" w:themeColor="text2" w:themeTint="BF"/>
-                            </w:rPr>
-                            <w:t>Binôme </w:t>
+                            <w:t>Groupe / Binôme </w:t>
                           </w:r>
                           <w:r>
                             <w:rPr>
@@ -921,7 +916,33 @@
                                     <w:sz w:val="21"/>
                                     <w:szCs w:val="21"/>
                                   </w:rPr>
-                                  <w:t xml:space="preserve"> Universitaire 2025–2026  |  Avril 2026</w:t>
+                                  <w:t xml:space="preserve"> Universitaire 2025–</w:t>
+                                </w:r>
+                                <w:proofErr w:type="gramStart"/>
+                                <w:r>
+                                  <w:rPr>
+                                    <w:b/>
+                                    <w:bCs/>
+                                    <w:i/>
+                                    <w:iCs/>
+                                    <w:color w:val="215E99" w:themeColor="text2" w:themeTint="BF"/>
+                                    <w:sz w:val="21"/>
+                                    <w:szCs w:val="21"/>
+                                  </w:rPr>
+                                  <w:t>2026  |</w:t>
+                                </w:r>
+                                <w:proofErr w:type="gramEnd"/>
+                                <w:r>
+                                  <w:rPr>
+                                    <w:b/>
+                                    <w:bCs/>
+                                    <w:i/>
+                                    <w:iCs/>
+                                    <w:color w:val="215E99" w:themeColor="text2" w:themeTint="BF"/>
+                                    <w:sz w:val="21"/>
+                                    <w:szCs w:val="21"/>
+                                  </w:rPr>
+                                  <w:t xml:space="preserve">  Avril 2026</w:t>
                                 </w:r>
                               </w:p>
                               <w:p>
@@ -994,7 +1015,33 @@
                               <w:sz w:val="21"/>
                               <w:szCs w:val="21"/>
                             </w:rPr>
-                            <w:t xml:space="preserve"> Universitaire 2025–2026  |  Avril 2026</w:t>
+                            <w:t xml:space="preserve"> Universitaire 2025–</w:t>
+                          </w:r>
+                          <w:proofErr w:type="gramStart"/>
+                          <w:r>
+                            <w:rPr>
+                              <w:b/>
+                              <w:bCs/>
+                              <w:i/>
+                              <w:iCs/>
+                              <w:color w:val="215E99" w:themeColor="text2" w:themeTint="BF"/>
+                              <w:sz w:val="21"/>
+                              <w:szCs w:val="21"/>
+                            </w:rPr>
+                            <w:t>2026  |</w:t>
+                          </w:r>
+                          <w:proofErr w:type="gramEnd"/>
+                          <w:r>
+                            <w:rPr>
+                              <w:b/>
+                              <w:bCs/>
+                              <w:i/>
+                              <w:iCs/>
+                              <w:color w:val="215E99" w:themeColor="text2" w:themeTint="BF"/>
+                              <w:sz w:val="21"/>
+                              <w:szCs w:val="21"/>
+                            </w:rPr>
+                            <w:t xml:space="preserve">  Avril 2026</w:t>
                           </w:r>
                         </w:p>
                         <w:p>
@@ -1087,98 +1134,84 @@
         </w:rPr>
         <w:t xml:space="preserve"> est au </w:t>
       </w:r>
-      <w:proofErr w:type="spellStart"/>
-      <w:r>
-        <w:rPr>
-          <w:color w:val="2C2C2C"/>
-        </w:rPr>
-        <w:t>coeur</w:t>
-      </w:r>
-      <w:proofErr w:type="spellEnd"/>
+      <w:r>
+        <w:rPr>
+          <w:color w:val="2C2C2C"/>
+        </w:rPr>
+        <w:t>cœur</w:t>
+      </w:r>
       <w:r>
         <w:rPr>
           <w:color w:val="2C2C2C"/>
         </w:rPr>
         <w:t xml:space="preserve"> des </w:t>
       </w:r>
-      <w:proofErr w:type="spellStart"/>
-      <w:r>
-        <w:rPr>
-          <w:color w:val="2C2C2C"/>
-        </w:rPr>
-        <w:t>systemes</w:t>
-      </w:r>
-      <w:proofErr w:type="spellEnd"/>
+      <w:r>
+        <w:rPr>
+          <w:color w:val="2C2C2C"/>
+        </w:rPr>
+        <w:t>systèmes</w:t>
+      </w:r>
       <w:r>
         <w:rPr>
           <w:color w:val="2C2C2C"/>
         </w:rPr>
         <w:t xml:space="preserve"> </w:t>
       </w:r>
-      <w:proofErr w:type="spellStart"/>
-      <w:r>
-        <w:rPr>
-          <w:color w:val="2C2C2C"/>
-        </w:rPr>
-        <w:t>multimedia</w:t>
-      </w:r>
-      <w:proofErr w:type="spellEnd"/>
+      <w:r>
+        <w:rPr>
+          <w:color w:val="2C2C2C"/>
+        </w:rPr>
+        <w:t>multimédia</w:t>
+      </w:r>
       <w:r>
         <w:rPr>
           <w:color w:val="2C2C2C"/>
         </w:rPr>
         <w:t xml:space="preserve"> modernes. Chaque </w:t>
       </w:r>
-      <w:proofErr w:type="spellStart"/>
-      <w:r>
-        <w:rPr>
-          <w:color w:val="2C2C2C"/>
-        </w:rPr>
-        <w:t>video</w:t>
-      </w:r>
-      <w:proofErr w:type="spellEnd"/>
+      <w:r>
+        <w:rPr>
+          <w:color w:val="2C2C2C"/>
+        </w:rPr>
+        <w:t>vidéo</w:t>
+      </w:r>
       <w:r>
         <w:rPr>
           <w:color w:val="2C2C2C"/>
         </w:rPr>
         <w:t xml:space="preserve"> que vous diffusez, enregistrez ou partagez repose sur un codec : un </w:t>
       </w:r>
-      <w:proofErr w:type="spellStart"/>
-      <w:r>
-        <w:rPr>
-          <w:color w:val="2C2C2C"/>
-        </w:rPr>
-        <w:t>systeme</w:t>
-      </w:r>
-      <w:proofErr w:type="spellEnd"/>
+      <w:r>
+        <w:rPr>
+          <w:color w:val="2C2C2C"/>
+        </w:rPr>
+        <w:t>système</w:t>
+      </w:r>
       <w:r>
         <w:rPr>
           <w:color w:val="2C2C2C"/>
         </w:rPr>
         <w:t xml:space="preserve"> qui encode les </w:t>
       </w:r>
-      <w:proofErr w:type="spellStart"/>
-      <w:r>
-        <w:rPr>
-          <w:color w:val="2C2C2C"/>
-        </w:rPr>
-        <w:t>donnees</w:t>
-      </w:r>
-      <w:proofErr w:type="spellEnd"/>
+      <w:r>
+        <w:rPr>
+          <w:color w:val="2C2C2C"/>
+        </w:rPr>
+        <w:t>données</w:t>
+      </w:r>
       <w:r>
         <w:rPr>
           <w:color w:val="2C2C2C"/>
         </w:rPr>
         <w:t xml:space="preserve"> visuelles brutes en un flux binaire compact et les </w:t>
       </w:r>
-      <w:proofErr w:type="spellStart"/>
-      <w:r>
-        <w:rPr>
-          <w:color w:val="2C2C2C"/>
-        </w:rPr>
-        <w:t>decode</w:t>
-      </w:r>
-      <w:proofErr w:type="spellEnd"/>
+      <w:r>
+        <w:rPr>
+          <w:color w:val="2C2C2C"/>
+        </w:rPr>
+        <w:t>décode</w:t>
+      </w:r>
       <w:r>
         <w:rPr>
           <w:color w:val="2C2C2C"/>
@@ -1197,56 +1230,48 @@
         </w:rPr>
         <w:t xml:space="preserve">Dans ce projet, nous </w:t>
       </w:r>
-      <w:proofErr w:type="spellStart"/>
-      <w:r>
-        <w:rPr>
-          <w:color w:val="2C2C2C"/>
-        </w:rPr>
-        <w:t>implementons</w:t>
-      </w:r>
-      <w:proofErr w:type="spellEnd"/>
+      <w:r>
+        <w:rPr>
+          <w:color w:val="2C2C2C"/>
+        </w:rPr>
+        <w:t>implémentons</w:t>
+      </w:r>
       <w:r>
         <w:rPr>
           <w:color w:val="2C2C2C"/>
         </w:rPr>
         <w:t xml:space="preserve"> un pipeline d'encodage simplifie mais complet de type MPEG-4 en Python, couvrant les cinq </w:t>
       </w:r>
-      <w:proofErr w:type="spellStart"/>
-      <w:r>
-        <w:rPr>
-          <w:color w:val="2C2C2C"/>
-        </w:rPr>
-        <w:t>etapes</w:t>
-      </w:r>
-      <w:proofErr w:type="spellEnd"/>
+      <w:r>
+        <w:rPr>
+          <w:color w:val="2C2C2C"/>
+        </w:rPr>
+        <w:t>étapes</w:t>
+      </w:r>
       <w:r>
         <w:rPr>
           <w:color w:val="2C2C2C"/>
         </w:rPr>
         <w:t xml:space="preserve"> obligatoires : </w:t>
       </w:r>
-      <w:proofErr w:type="spellStart"/>
-      <w:r>
-        <w:rPr>
-          <w:color w:val="2C2C2C"/>
-        </w:rPr>
-        <w:t>pre-traitement</w:t>
-      </w:r>
-      <w:proofErr w:type="spellEnd"/>
+      <w:r>
+        <w:rPr>
+          <w:color w:val="2C2C2C"/>
+        </w:rPr>
+        <w:t>pré-traitement</w:t>
+      </w:r>
       <w:r>
         <w:rPr>
           <w:color w:val="2C2C2C"/>
         </w:rPr>
         <w:t xml:space="preserve">, codage intra-trame (I-frames), codage inter-trames (P-frames), codage entropique, et </w:t>
       </w:r>
-      <w:proofErr w:type="spellStart"/>
-      <w:r>
-        <w:rPr>
-          <w:color w:val="2C2C2C"/>
-        </w:rPr>
-        <w:t>evaluation</w:t>
-      </w:r>
-      <w:proofErr w:type="spellEnd"/>
+      <w:r>
+        <w:rPr>
+          <w:color w:val="2C2C2C"/>
+        </w:rPr>
+        <w:t>évaluation</w:t>
+      </w:r>
       <w:r>
         <w:rPr>
           <w:color w:val="2C2C2C"/>
@@ -1268,70 +1293,60 @@
         </w:rPr>
         <w:t xml:space="preserve">Le pipeline prend en </w:t>
       </w:r>
-      <w:proofErr w:type="spellStart"/>
-      <w:r>
-        <w:rPr>
-          <w:color w:val="2C2C2C"/>
-        </w:rPr>
-        <w:t>entree</w:t>
-      </w:r>
-      <w:proofErr w:type="spellEnd"/>
+      <w:r>
+        <w:rPr>
+          <w:color w:val="2C2C2C"/>
+        </w:rPr>
+        <w:t>entrée</w:t>
+      </w:r>
       <w:r>
         <w:rPr>
           <w:color w:val="2C2C2C"/>
         </w:rPr>
         <w:t xml:space="preserve"> un dossier de trames PNG/JPG </w:t>
       </w:r>
-      <w:proofErr w:type="spellStart"/>
-      <w:r>
-        <w:rPr>
-          <w:color w:val="2C2C2C"/>
-        </w:rPr>
-        <w:t>sequentielles</w:t>
-      </w:r>
-      <w:proofErr w:type="spellEnd"/>
+      <w:r>
+        <w:rPr>
+          <w:color w:val="2C2C2C"/>
+        </w:rPr>
+        <w:t>séquentielles</w:t>
+      </w:r>
       <w:r>
         <w:rPr>
           <w:color w:val="2C2C2C"/>
         </w:rPr>
         <w:t xml:space="preserve"> et produit un seul fichier .bin compresse, </w:t>
       </w:r>
-      <w:proofErr w:type="spellStart"/>
-      <w:r>
-        <w:rPr>
-          <w:color w:val="2C2C2C"/>
-        </w:rPr>
-        <w:t>dechiffrable</w:t>
-      </w:r>
-      <w:proofErr w:type="spellEnd"/>
+      <w:r>
+        <w:rPr>
+          <w:color w:val="2C2C2C"/>
+        </w:rPr>
+        <w:t>déchiffrable</w:t>
+      </w:r>
       <w:r>
         <w:rPr>
           <w:color w:val="2C2C2C"/>
         </w:rPr>
         <w:t xml:space="preserve"> en images avec des </w:t>
       </w:r>
-      <w:proofErr w:type="spellStart"/>
-      <w:r>
-        <w:rPr>
-          <w:color w:val="2C2C2C"/>
-        </w:rPr>
-        <w:t>metriques</w:t>
-      </w:r>
-      <w:proofErr w:type="spellEnd"/>
+      <w:r>
+        <w:rPr>
+          <w:color w:val="2C2C2C"/>
+        </w:rPr>
+        <w:t>métriques</w:t>
+      </w:r>
       <w:r>
         <w:rPr>
           <w:color w:val="2C2C2C"/>
         </w:rPr>
         <w:t xml:space="preserve"> de </w:t>
       </w:r>
-      <w:proofErr w:type="spellStart"/>
-      <w:r>
-        <w:rPr>
-          <w:color w:val="2C2C2C"/>
-        </w:rPr>
-        <w:t>qualite</w:t>
-      </w:r>
-      <w:proofErr w:type="spellEnd"/>
+      <w:r>
+        <w:rPr>
+          <w:color w:val="2C2C2C"/>
+        </w:rPr>
+        <w:t>qualité</w:t>
+      </w:r>
       <w:r>
         <w:rPr>
           <w:color w:val="2C2C2C"/>
@@ -1366,37 +1381,66 @@
     <w:p>
       <w:pPr>
         <w:pStyle w:val="Titre2"/>
-      </w:pPr>
-      <w:r>
-        <w:t>Etape 1</w:t>
-      </w:r>
-      <w:r>
+        <w:rPr>
+          <w:color w:val="215E99" w:themeColor="text2" w:themeTint="BF"/>
+        </w:rPr>
+      </w:pPr>
+      <w:r>
+        <w:rPr>
+          <w:color w:val="215E99" w:themeColor="text2" w:themeTint="BF"/>
+        </w:rPr>
+        <w:t xml:space="preserve">Etape </w:t>
+      </w:r>
+      <w:proofErr w:type="gramStart"/>
+      <w:r>
+        <w:rPr>
+          <w:color w:val="215E99" w:themeColor="text2" w:themeTint="BF"/>
+        </w:rPr>
+        <w:t>1</w:t>
+      </w:r>
+      <w:r>
+        <w:rPr>
+          <w:color w:val="215E99" w:themeColor="text2" w:themeTint="BF"/>
+        </w:rPr>
         <w:t xml:space="preserve"> )</w:t>
       </w:r>
-      <w:r>
+      <w:proofErr w:type="gramEnd"/>
+      <w:r>
+        <w:rPr>
+          <w:color w:val="215E99" w:themeColor="text2" w:themeTint="BF"/>
+        </w:rPr>
         <w:t xml:space="preserve"> </w:t>
       </w:r>
-      <w:proofErr w:type="spellStart"/>
-      <w:r>
-        <w:t>Pre-traitement</w:t>
-      </w:r>
-      <w:proofErr w:type="spellEnd"/>
-      <w:r>
+      <w:r>
+        <w:rPr>
+          <w:color w:val="215E99" w:themeColor="text2" w:themeTint="BF"/>
+        </w:rPr>
+        <w:t>Pré-traitement</w:t>
+      </w:r>
+      <w:r>
+        <w:rPr>
+          <w:color w:val="215E99" w:themeColor="text2" w:themeTint="BF"/>
+        </w:rPr>
         <w:t xml:space="preserve"> : Conversion en espace </w:t>
       </w:r>
-      <w:proofErr w:type="spellStart"/>
-      <w:r>
-        <w:t>colorimetrique</w:t>
-      </w:r>
-      <w:proofErr w:type="spellEnd"/>
-      <w:r>
+      <w:r>
+        <w:rPr>
+          <w:color w:val="215E99" w:themeColor="text2" w:themeTint="BF"/>
+        </w:rPr>
+        <w:t>colorimétrique</w:t>
+      </w:r>
+      <w:r>
+        <w:rPr>
+          <w:color w:val="215E99" w:themeColor="text2" w:themeTint="BF"/>
+        </w:rPr>
         <w:t xml:space="preserve"> et sous-</w:t>
       </w:r>
-      <w:proofErr w:type="spellStart"/>
-      <w:r>
-        <w:t>echantillonnage</w:t>
-      </w:r>
-      <w:proofErr w:type="spellEnd"/>
+      <w:r>
+        <w:rPr>
+          <w:color w:val="215E99" w:themeColor="text2" w:themeTint="BF"/>
+        </w:rPr>
+        <w:t>échantillonnage</w:t>
+      </w:r>
     </w:p>
     <w:p>
       <w:pPr>
@@ -1409,56 +1453,50 @@
         </w:rPr>
         <w:t>Chaque trame BGR d'</w:t>
       </w:r>
+      <w:r>
+        <w:rPr>
+          <w:color w:val="2C2C2C"/>
+        </w:rPr>
+        <w:t>entrée</w:t>
+      </w:r>
+      <w:r>
+        <w:rPr>
+          <w:color w:val="2C2C2C"/>
+        </w:rPr>
+        <w:t xml:space="preserve"> est d'abord convertie dans l'espace </w:t>
+      </w:r>
+      <w:r>
+        <w:rPr>
+          <w:color w:val="2C2C2C"/>
+        </w:rPr>
+        <w:t>colorimétrique</w:t>
+      </w:r>
+      <w:r>
+        <w:rPr>
+          <w:color w:val="2C2C2C"/>
+        </w:rPr>
+        <w:t xml:space="preserve"> </w:t>
+      </w:r>
       <w:proofErr w:type="spellStart"/>
       <w:r>
         <w:rPr>
           <w:color w:val="2C2C2C"/>
         </w:rPr>
-        <w:t>entree</w:t>
+        <w:t>YCbCr</w:t>
       </w:r>
       <w:proofErr w:type="spellEnd"/>
       <w:r>
         <w:rPr>
           <w:color w:val="2C2C2C"/>
         </w:rPr>
-        <w:t xml:space="preserve"> est d'abord convertie dans l'espace </w:t>
-      </w:r>
-      <w:proofErr w:type="spellStart"/>
-      <w:r>
-        <w:rPr>
-          <w:color w:val="2C2C2C"/>
-        </w:rPr>
-        <w:t>colorimetrique</w:t>
-      </w:r>
-      <w:proofErr w:type="spellEnd"/>
-      <w:r>
-        <w:rPr>
-          <w:color w:val="2C2C2C"/>
-        </w:rPr>
-        <w:t xml:space="preserve"> </w:t>
-      </w:r>
-      <w:proofErr w:type="spellStart"/>
-      <w:r>
-        <w:rPr>
-          <w:color w:val="2C2C2C"/>
-        </w:rPr>
-        <w:t>YCbCr</w:t>
-      </w:r>
-      <w:proofErr w:type="spellEnd"/>
-      <w:r>
-        <w:rPr>
-          <w:color w:val="2C2C2C"/>
-        </w:rPr>
         <w:t xml:space="preserve"> selon la norme BT.601. Le canal de luminance Y porte le </w:t>
       </w:r>
-      <w:proofErr w:type="spellStart"/>
-      <w:r>
-        <w:rPr>
-          <w:color w:val="2C2C2C"/>
-        </w:rPr>
-        <w:t>detail</w:t>
-      </w:r>
-      <w:proofErr w:type="spellEnd"/>
+      <w:r>
+        <w:rPr>
+          <w:color w:val="2C2C2C"/>
+        </w:rPr>
+        <w:t>détail</w:t>
+      </w:r>
       <w:r>
         <w:rPr>
           <w:color w:val="2C2C2C"/>
@@ -1491,126 +1529,136 @@
         </w:rPr>
         <w:t xml:space="preserve">Un </w:t>
       </w:r>
-      <w:proofErr w:type="spellStart"/>
-      <w:r>
-        <w:rPr>
-          <w:color w:val="2C2C2C"/>
-        </w:rPr>
-        <w:t>schema</w:t>
-      </w:r>
-      <w:proofErr w:type="spellEnd"/>
+      <w:r>
+        <w:rPr>
+          <w:color w:val="2C2C2C"/>
+        </w:rPr>
+        <w:t>schéma</w:t>
+      </w:r>
       <w:r>
         <w:rPr>
           <w:color w:val="2C2C2C"/>
         </w:rPr>
         <w:t xml:space="preserve"> de sous-</w:t>
       </w:r>
-      <w:proofErr w:type="spellStart"/>
-      <w:r>
-        <w:rPr>
-          <w:color w:val="2C2C2C"/>
-        </w:rPr>
-        <w:t>echantillonnage</w:t>
-      </w:r>
-      <w:proofErr w:type="spellEnd"/>
-      <w:r>
-        <w:rPr>
-          <w:color w:val="2C2C2C"/>
-        </w:rPr>
-        <w:t xml:space="preserve"> chromatique 4:2:0 est ensuite applique : les deux plans de chrominance sont filtres par une moyenne et </w:t>
-      </w:r>
-      <w:proofErr w:type="spellStart"/>
-      <w:r>
-        <w:rPr>
-          <w:color w:val="2C2C2C"/>
-        </w:rPr>
-        <w:t>reduits</w:t>
-      </w:r>
-      <w:proofErr w:type="spellEnd"/>
+      <w:r>
+        <w:rPr>
+          <w:color w:val="2C2C2C"/>
+        </w:rPr>
+        <w:t>échantillonnage</w:t>
+      </w:r>
+      <w:r>
+        <w:rPr>
+          <w:color w:val="2C2C2C"/>
+        </w:rPr>
+        <w:t xml:space="preserve"> chromatique </w:t>
+      </w:r>
+      <w:proofErr w:type="gramStart"/>
+      <w:r>
+        <w:rPr>
+          <w:color w:val="2C2C2C"/>
+        </w:rPr>
+        <w:t>4:2:</w:t>
+      </w:r>
+      <w:proofErr w:type="gramEnd"/>
+      <w:r>
+        <w:rPr>
+          <w:color w:val="2C2C2C"/>
+        </w:rPr>
+        <w:t xml:space="preserve">0 est ensuite applique : les deux plans de chrominance sont </w:t>
+      </w:r>
+      <w:proofErr w:type="gramStart"/>
+      <w:r>
+        <w:rPr>
+          <w:color w:val="2C2C2C"/>
+        </w:rPr>
+        <w:t>filtres</w:t>
+      </w:r>
+      <w:proofErr w:type="gramEnd"/>
+      <w:r>
+        <w:rPr>
+          <w:color w:val="2C2C2C"/>
+        </w:rPr>
+        <w:t xml:space="preserve"> par une moyenne et </w:t>
+      </w:r>
+      <w:r>
+        <w:rPr>
+          <w:color w:val="2C2C2C"/>
+        </w:rPr>
+        <w:t>réduits</w:t>
+      </w:r>
       <w:r>
         <w:rPr>
           <w:color w:val="2C2C2C"/>
         </w:rPr>
         <w:t xml:space="preserve"> par un facteur 2 horizontalement et verticalement, </w:t>
       </w:r>
-      <w:proofErr w:type="spellStart"/>
-      <w:r>
-        <w:rPr>
-          <w:color w:val="2C2C2C"/>
-        </w:rPr>
-        <w:t>reduisant</w:t>
-      </w:r>
-      <w:proofErr w:type="spellEnd"/>
+      <w:r>
+        <w:rPr>
+          <w:color w:val="2C2C2C"/>
+        </w:rPr>
+        <w:t>réduisant</w:t>
+      </w:r>
       <w:r>
         <w:rPr>
           <w:color w:val="2C2C2C"/>
         </w:rPr>
         <w:t xml:space="preserve"> leur </w:t>
       </w:r>
-      <w:proofErr w:type="spellStart"/>
-      <w:r>
-        <w:rPr>
-          <w:color w:val="2C2C2C"/>
-        </w:rPr>
-        <w:t>resolution</w:t>
-      </w:r>
-      <w:proofErr w:type="spellEnd"/>
+      <w:r>
+        <w:rPr>
+          <w:color w:val="2C2C2C"/>
+        </w:rPr>
+        <w:t>résolution</w:t>
+      </w:r>
       <w:r>
         <w:rPr>
           <w:color w:val="2C2C2C"/>
         </w:rPr>
         <w:t xml:space="preserve"> de </w:t>
       </w:r>
-      <w:proofErr w:type="spellStart"/>
-      <w:r>
-        <w:rPr>
-          <w:color w:val="2C2C2C"/>
-        </w:rPr>
-        <w:t>moitie</w:t>
-      </w:r>
-      <w:proofErr w:type="spellEnd"/>
+      <w:r>
+        <w:rPr>
+          <w:color w:val="2C2C2C"/>
+        </w:rPr>
+        <w:t>moitié</w:t>
+      </w:r>
       <w:r>
         <w:rPr>
           <w:color w:val="2C2C2C"/>
         </w:rPr>
         <w:t xml:space="preserve">. Cela seul </w:t>
       </w:r>
-      <w:proofErr w:type="spellStart"/>
-      <w:r>
-        <w:rPr>
-          <w:color w:val="2C2C2C"/>
-        </w:rPr>
-        <w:t>reduit</w:t>
-      </w:r>
-      <w:proofErr w:type="spellEnd"/>
+      <w:r>
+        <w:rPr>
+          <w:color w:val="2C2C2C"/>
+        </w:rPr>
+        <w:t>réduit</w:t>
+      </w:r>
       <w:r>
         <w:rPr>
           <w:color w:val="2C2C2C"/>
         </w:rPr>
         <w:t xml:space="preserve"> le volume de </w:t>
       </w:r>
-      <w:proofErr w:type="spellStart"/>
-      <w:r>
-        <w:rPr>
-          <w:color w:val="2C2C2C"/>
-        </w:rPr>
-        <w:t>donnees</w:t>
-      </w:r>
-      <w:proofErr w:type="spellEnd"/>
+      <w:r>
+        <w:rPr>
+          <w:color w:val="2C2C2C"/>
+        </w:rPr>
+        <w:t>données</w:t>
+      </w:r>
       <w:r>
         <w:rPr>
           <w:color w:val="2C2C2C"/>
         </w:rPr>
         <w:t xml:space="preserve"> brutes d'environ 50 % avant tout codage par </w:t>
       </w:r>
-      <w:proofErr w:type="spellStart"/>
-      <w:r>
-        <w:rPr>
-          <w:color w:val="2C2C2C"/>
-        </w:rPr>
-        <w:t>transformee</w:t>
-      </w:r>
-      <w:proofErr w:type="spellEnd"/>
+      <w:r>
+        <w:rPr>
+          <w:color w:val="2C2C2C"/>
+        </w:rPr>
+        <w:t>transformée</w:t>
+      </w:r>
       <w:r>
         <w:rPr>
           <w:color w:val="2C2C2C"/>
@@ -1626,14 +1674,26 @@
     <w:p>
       <w:pPr>
         <w:pStyle w:val="Titre2"/>
-      </w:pPr>
-      <w:r>
+        <w:rPr>
+          <w:color w:val="215E99" w:themeColor="text2" w:themeTint="BF"/>
+        </w:rPr>
+      </w:pPr>
+      <w:r>
+        <w:rPr>
+          <w:color w:val="215E99" w:themeColor="text2" w:themeTint="BF"/>
+        </w:rPr>
         <w:t>Etape 2</w:t>
       </w:r>
       <w:r>
+        <w:rPr>
+          <w:color w:val="215E99" w:themeColor="text2" w:themeTint="BF"/>
+        </w:rPr>
         <w:t>)</w:t>
       </w:r>
       <w:r>
+        <w:rPr>
+          <w:color w:val="215E99" w:themeColor="text2" w:themeTint="BF"/>
+        </w:rPr>
         <w:t xml:space="preserve"> Codage Intra-trame (I-frames) : DCT + Quantification</w:t>
       </w:r>
     </w:p>
@@ -1648,56 +1708,48 @@
         </w:rPr>
         <w:t>Chaque G-</w:t>
       </w:r>
-      <w:proofErr w:type="spellStart"/>
-      <w:r>
-        <w:rPr>
-          <w:color w:val="2C2C2C"/>
-        </w:rPr>
-        <w:t>ieme</w:t>
-      </w:r>
-      <w:proofErr w:type="spellEnd"/>
+      <w:r>
+        <w:rPr>
+          <w:color w:val="2C2C2C"/>
+        </w:rPr>
+        <w:t>IIème</w:t>
+      </w:r>
       <w:r>
         <w:rPr>
           <w:color w:val="2C2C2C"/>
         </w:rPr>
         <w:t xml:space="preserve"> trame (ou G est la taille du GOP) est </w:t>
       </w:r>
-      <w:proofErr w:type="spellStart"/>
-      <w:r>
-        <w:rPr>
-          <w:color w:val="2C2C2C"/>
-        </w:rPr>
-        <w:t>codee</w:t>
-      </w:r>
-      <w:proofErr w:type="spellEnd"/>
+      <w:r>
+        <w:rPr>
+          <w:color w:val="2C2C2C"/>
+        </w:rPr>
+        <w:t>codée</w:t>
+      </w:r>
       <w:r>
         <w:rPr>
           <w:color w:val="2C2C2C"/>
         </w:rPr>
         <w:t xml:space="preserve"> comme une I-frame, </w:t>
       </w:r>
-      <w:proofErr w:type="spellStart"/>
-      <w:r>
-        <w:rPr>
-          <w:color w:val="2C2C2C"/>
-        </w:rPr>
-        <w:t>independamment</w:t>
-      </w:r>
-      <w:proofErr w:type="spellEnd"/>
+      <w:r>
+        <w:rPr>
+          <w:color w:val="2C2C2C"/>
+        </w:rPr>
+        <w:t>indépendamment</w:t>
+      </w:r>
       <w:r>
         <w:rPr>
           <w:color w:val="2C2C2C"/>
         </w:rPr>
         <w:t xml:space="preserve"> de toutes les autres trames. La </w:t>
       </w:r>
-      <w:proofErr w:type="spellStart"/>
-      <w:r>
-        <w:rPr>
-          <w:color w:val="2C2C2C"/>
-        </w:rPr>
-        <w:t>procedure</w:t>
-      </w:r>
-      <w:proofErr w:type="spellEnd"/>
+      <w:r>
+        <w:rPr>
+          <w:color w:val="2C2C2C"/>
+        </w:rPr>
+        <w:t>procédure</w:t>
+      </w:r>
       <w:r>
         <w:rPr>
           <w:color w:val="2C2C2C"/>
@@ -1720,18 +1772,34 @@
           <w:sz w:val="21"/>
           <w:szCs w:val="21"/>
         </w:rPr>
-        <w:t xml:space="preserve">Chaque plan (Y, Cb, Cr) est centre a </w:t>
-      </w:r>
-      <w:proofErr w:type="spellStart"/>
-      <w:r>
-        <w:rPr>
-          <w:color w:val="2C2C2C"/>
-          <w:sz w:val="21"/>
-          <w:szCs w:val="21"/>
-        </w:rPr>
-        <w:t>zero</w:t>
-      </w:r>
-      <w:proofErr w:type="spellEnd"/>
+        <w:t xml:space="preserve">Chaque plan (Y, Cb, Cr) est centre </w:t>
+      </w:r>
+      <w:proofErr w:type="gramStart"/>
+      <w:r>
+        <w:rPr>
+          <w:color w:val="2C2C2C"/>
+          <w:sz w:val="21"/>
+          <w:szCs w:val="21"/>
+        </w:rPr>
+        <w:t>a</w:t>
+      </w:r>
+      <w:proofErr w:type="gramEnd"/>
+      <w:r>
+        <w:rPr>
+          <w:color w:val="2C2C2C"/>
+          <w:sz w:val="21"/>
+          <w:szCs w:val="21"/>
+        </w:rPr>
+        <w:t xml:space="preserve"> </w:t>
+      </w:r>
+      <w:r>
+        <w:rPr>
+          <w:color w:val="2C2C2C"/>
+          <w:sz w:val="21"/>
+          <w:szCs w:val="21"/>
+        </w:rPr>
+        <w:t>zéro</w:t>
+      </w:r>
       <w:r>
         <w:rPr>
           <w:color w:val="2C2C2C"/>
@@ -1758,16 +1826,14 @@
         </w:rPr>
         <w:t xml:space="preserve">La </w:t>
       </w:r>
-      <w:proofErr w:type="spellStart"/>
-      <w:r>
-        <w:rPr>
-          <w:color w:val="2C2C2C"/>
-          <w:sz w:val="21"/>
-          <w:szCs w:val="21"/>
-        </w:rPr>
-        <w:t>Transformee</w:t>
-      </w:r>
-      <w:proofErr w:type="spellEnd"/>
+      <w:r>
+        <w:rPr>
+          <w:color w:val="2C2C2C"/>
+          <w:sz w:val="21"/>
+          <w:szCs w:val="21"/>
+        </w:rPr>
+        <w:t>Transformée</w:t>
+      </w:r>
       <w:r>
         <w:rPr>
           <w:color w:val="2C2C2C"/>
@@ -1776,16 +1842,14 @@
         </w:rPr>
         <w:t xml:space="preserve"> en Cosinus </w:t>
       </w:r>
-      <w:proofErr w:type="spellStart"/>
-      <w:r>
-        <w:rPr>
-          <w:color w:val="2C2C2C"/>
-          <w:sz w:val="21"/>
-          <w:szCs w:val="21"/>
-        </w:rPr>
-        <w:t>Discrete</w:t>
-      </w:r>
-      <w:proofErr w:type="spellEnd"/>
+      <w:r>
+        <w:rPr>
+          <w:color w:val="2C2C2C"/>
+          <w:sz w:val="21"/>
+          <w:szCs w:val="21"/>
+        </w:rPr>
+        <w:t>Discrète</w:t>
+      </w:r>
       <w:r>
         <w:rPr>
           <w:color w:val="2C2C2C"/>
@@ -1794,34 +1858,48 @@
         </w:rPr>
         <w:t xml:space="preserve"> 2D (DCT-II) est </w:t>
       </w:r>
-      <w:proofErr w:type="spellStart"/>
-      <w:r>
-        <w:rPr>
-          <w:color w:val="2C2C2C"/>
-          <w:sz w:val="21"/>
-          <w:szCs w:val="21"/>
-        </w:rPr>
-        <w:t>appliquee</w:t>
-      </w:r>
-      <w:proofErr w:type="spellEnd"/>
-      <w:r>
-        <w:rPr>
-          <w:color w:val="2C2C2C"/>
-          <w:sz w:val="21"/>
-          <w:szCs w:val="21"/>
-        </w:rPr>
-        <w:t xml:space="preserve"> a chaque bloc via cv2.dct, convertissant les valeurs de pixels spatiaux en coefficients </w:t>
-      </w:r>
-      <w:proofErr w:type="spellStart"/>
-      <w:r>
-        <w:rPr>
-          <w:color w:val="2C2C2C"/>
-          <w:sz w:val="21"/>
-          <w:szCs w:val="21"/>
-        </w:rPr>
-        <w:t>frequentiels</w:t>
-      </w:r>
-      <w:proofErr w:type="spellEnd"/>
+      <w:r>
+        <w:rPr>
+          <w:color w:val="2C2C2C"/>
+          <w:sz w:val="21"/>
+          <w:szCs w:val="21"/>
+        </w:rPr>
+        <w:t>appliquée</w:t>
+      </w:r>
+      <w:r>
+        <w:rPr>
+          <w:color w:val="2C2C2C"/>
+          <w:sz w:val="21"/>
+          <w:szCs w:val="21"/>
+        </w:rPr>
+        <w:t xml:space="preserve"> </w:t>
+      </w:r>
+      <w:proofErr w:type="gramStart"/>
+      <w:r>
+        <w:rPr>
+          <w:color w:val="2C2C2C"/>
+          <w:sz w:val="21"/>
+          <w:szCs w:val="21"/>
+        </w:rPr>
+        <w:t>a</w:t>
+      </w:r>
+      <w:proofErr w:type="gramEnd"/>
+      <w:r>
+        <w:rPr>
+          <w:color w:val="2C2C2C"/>
+          <w:sz w:val="21"/>
+          <w:szCs w:val="21"/>
+        </w:rPr>
+        <w:t xml:space="preserve"> chaque bloc via cv2.dct, convertissant les valeurs de pixels spatiaux en coefficients </w:t>
+      </w:r>
+      <w:r>
+        <w:rPr>
+          <w:color w:val="2C2C2C"/>
+          <w:sz w:val="21"/>
+          <w:szCs w:val="21"/>
+        </w:rPr>
+        <w:t>fréquentiels</w:t>
+      </w:r>
       <w:r>
         <w:rPr>
           <w:color w:val="2C2C2C"/>
@@ -1846,54 +1924,70 @@
           <w:sz w:val="21"/>
           <w:szCs w:val="21"/>
         </w:rPr>
-        <w:t xml:space="preserve">Les coefficients sont divises </w:t>
+        <w:t xml:space="preserve">Les coefficients sont </w:t>
+      </w:r>
+      <w:proofErr w:type="gramStart"/>
+      <w:r>
+        <w:rPr>
+          <w:color w:val="2C2C2C"/>
+          <w:sz w:val="21"/>
+          <w:szCs w:val="21"/>
+        </w:rPr>
+        <w:t>divises</w:t>
+      </w:r>
+      <w:proofErr w:type="gramEnd"/>
+      <w:r>
+        <w:rPr>
+          <w:color w:val="2C2C2C"/>
+          <w:sz w:val="21"/>
+          <w:szCs w:val="21"/>
+        </w:rPr>
+        <w:t xml:space="preserve"> </w:t>
+      </w:r>
+      <w:r>
+        <w:rPr>
+          <w:color w:val="2C2C2C"/>
+          <w:sz w:val="21"/>
+          <w:szCs w:val="21"/>
+        </w:rPr>
+        <w:t>élément</w:t>
+      </w:r>
+      <w:r>
+        <w:rPr>
+          <w:color w:val="2C2C2C"/>
+          <w:sz w:val="21"/>
+          <w:szCs w:val="21"/>
+        </w:rPr>
+        <w:t xml:space="preserve"> par </w:t>
+      </w:r>
+      <w:r>
+        <w:rPr>
+          <w:color w:val="2C2C2C"/>
+          <w:sz w:val="21"/>
+          <w:szCs w:val="21"/>
+        </w:rPr>
+        <w:t>élément</w:t>
+      </w:r>
+      <w:r>
+        <w:rPr>
+          <w:color w:val="2C2C2C"/>
+          <w:sz w:val="21"/>
+          <w:szCs w:val="21"/>
+        </w:rPr>
+        <w:t xml:space="preserve"> par une table de quantification JPEG (luminance pour Y, chrominance pour Cb/Cr) mise </w:t>
       </w:r>
       <w:proofErr w:type="spellStart"/>
-      <w:r>
-        <w:rPr>
-          <w:color w:val="2C2C2C"/>
-          <w:sz w:val="21"/>
-          <w:szCs w:val="21"/>
-        </w:rPr>
-        <w:t>element</w:t>
+      <w:proofErr w:type="gramStart"/>
+      <w:r>
+        <w:rPr>
+          <w:color w:val="2C2C2C"/>
+          <w:sz w:val="21"/>
+          <w:szCs w:val="21"/>
+        </w:rPr>
+        <w:t>a</w:t>
       </w:r>
       <w:proofErr w:type="spellEnd"/>
-      <w:r>
-        <w:rPr>
-          <w:color w:val="2C2C2C"/>
-          <w:sz w:val="21"/>
-          <w:szCs w:val="21"/>
-        </w:rPr>
-        <w:t xml:space="preserve"> par </w:t>
-      </w:r>
-      <w:proofErr w:type="spellStart"/>
-      <w:r>
-        <w:rPr>
-          <w:color w:val="2C2C2C"/>
-          <w:sz w:val="21"/>
-          <w:szCs w:val="21"/>
-        </w:rPr>
-        <w:t>element</w:t>
-      </w:r>
-      <w:proofErr w:type="spellEnd"/>
-      <w:r>
-        <w:rPr>
-          <w:color w:val="2C2C2C"/>
-          <w:sz w:val="21"/>
-          <w:szCs w:val="21"/>
-        </w:rPr>
-        <w:t xml:space="preserve"> par une table de quantification JPEG (luminance pour Y, chrominance pour Cb/Cr) mise </w:t>
-      </w:r>
-      <w:proofErr w:type="spellStart"/>
-      <w:r>
-        <w:rPr>
-          <w:color w:val="2C2C2C"/>
-          <w:sz w:val="21"/>
-          <w:szCs w:val="21"/>
-        </w:rPr>
-        <w:t>a</w:t>
-      </w:r>
-      <w:proofErr w:type="spellEnd"/>
+      <w:proofErr w:type="gramEnd"/>
       <w:r>
         <w:rPr>
           <w:color w:val="2C2C2C"/>
@@ -1902,16 +1996,14 @@
         </w:rPr>
         <w:t xml:space="preserve"> l'</w:t>
       </w:r>
-      <w:proofErr w:type="spellStart"/>
-      <w:r>
-        <w:rPr>
-          <w:color w:val="2C2C2C"/>
-          <w:sz w:val="21"/>
-          <w:szCs w:val="21"/>
-        </w:rPr>
-        <w:t>echelle</w:t>
-      </w:r>
-      <w:proofErr w:type="spellEnd"/>
+      <w:r>
+        <w:rPr>
+          <w:color w:val="2C2C2C"/>
+          <w:sz w:val="21"/>
+          <w:szCs w:val="21"/>
+        </w:rPr>
+        <w:t>échelle</w:t>
+      </w:r>
       <w:r>
         <w:rPr>
           <w:color w:val="2C2C2C"/>
@@ -1920,16 +2012,14 @@
         </w:rPr>
         <w:t xml:space="preserve"> par un facteur </w:t>
       </w:r>
-      <w:proofErr w:type="spellStart"/>
-      <w:r>
-        <w:rPr>
-          <w:color w:val="2C2C2C"/>
-          <w:sz w:val="21"/>
-          <w:szCs w:val="21"/>
-        </w:rPr>
-        <w:t>qualite</w:t>
-      </w:r>
-      <w:proofErr w:type="spellEnd"/>
+      <w:r>
+        <w:rPr>
+          <w:color w:val="2C2C2C"/>
+          <w:sz w:val="21"/>
+          <w:szCs w:val="21"/>
+        </w:rPr>
+        <w:t>qualité</w:t>
+      </w:r>
       <w:r>
         <w:rPr>
           <w:color w:val="2C2C2C"/>
@@ -1938,16 +2028,14 @@
         </w:rPr>
         <w:t xml:space="preserve">, puis arrondis en entiers. Les </w:t>
       </w:r>
-      <w:proofErr w:type="spellStart"/>
-      <w:r>
-        <w:rPr>
-          <w:color w:val="2C2C2C"/>
-          <w:sz w:val="21"/>
-          <w:szCs w:val="21"/>
-        </w:rPr>
-        <w:t>entrees</w:t>
-      </w:r>
-      <w:proofErr w:type="spellEnd"/>
+      <w:r>
+        <w:rPr>
+          <w:color w:val="2C2C2C"/>
+          <w:sz w:val="21"/>
+          <w:szCs w:val="21"/>
+        </w:rPr>
+        <w:t>entrées</w:t>
+      </w:r>
       <w:r>
         <w:rPr>
           <w:color w:val="2C2C2C"/>
@@ -1956,16 +2044,14 @@
         </w:rPr>
         <w:t xml:space="preserve"> haute </w:t>
       </w:r>
-      <w:proofErr w:type="spellStart"/>
-      <w:r>
-        <w:rPr>
-          <w:color w:val="2C2C2C"/>
-          <w:sz w:val="21"/>
-          <w:szCs w:val="21"/>
-        </w:rPr>
-        <w:t>frequence</w:t>
-      </w:r>
-      <w:proofErr w:type="spellEnd"/>
+      <w:r>
+        <w:rPr>
+          <w:color w:val="2C2C2C"/>
+          <w:sz w:val="21"/>
+          <w:szCs w:val="21"/>
+        </w:rPr>
+        <w:t>fréquence</w:t>
+      </w:r>
       <w:r>
         <w:rPr>
           <w:color w:val="2C2C2C"/>
@@ -1974,16 +2060,14 @@
         </w:rPr>
         <w:t xml:space="preserve"> de la table sont plus grandes, supprimant agressivement les </w:t>
       </w:r>
-      <w:proofErr w:type="spellStart"/>
-      <w:r>
-        <w:rPr>
-          <w:color w:val="2C2C2C"/>
-          <w:sz w:val="21"/>
-          <w:szCs w:val="21"/>
-        </w:rPr>
-        <w:t>details</w:t>
-      </w:r>
-      <w:proofErr w:type="spellEnd"/>
+      <w:r>
+        <w:rPr>
+          <w:color w:val="2C2C2C"/>
+          <w:sz w:val="21"/>
+          <w:szCs w:val="21"/>
+        </w:rPr>
+        <w:t>détails</w:t>
+      </w:r>
       <w:r>
         <w:rPr>
           <w:color w:val="2C2C2C"/>
@@ -1992,16 +2076,14 @@
         </w:rPr>
         <w:t xml:space="preserve"> haute </w:t>
       </w:r>
-      <w:proofErr w:type="spellStart"/>
-      <w:r>
-        <w:rPr>
-          <w:color w:val="2C2C2C"/>
-          <w:sz w:val="21"/>
-          <w:szCs w:val="21"/>
-        </w:rPr>
-        <w:t>frequence</w:t>
-      </w:r>
-      <w:proofErr w:type="spellEnd"/>
+      <w:r>
+        <w:rPr>
+          <w:color w:val="2C2C2C"/>
+          <w:sz w:val="21"/>
+          <w:szCs w:val="21"/>
+        </w:rPr>
+        <w:t>fréquence</w:t>
+      </w:r>
       <w:r>
         <w:rPr>
           <w:color w:val="2C2C2C"/>
@@ -2010,16 +2092,14 @@
         </w:rPr>
         <w:t xml:space="preserve"> non </w:t>
       </w:r>
-      <w:proofErr w:type="spellStart"/>
-      <w:r>
-        <w:rPr>
-          <w:color w:val="2C2C2C"/>
-          <w:sz w:val="21"/>
-          <w:szCs w:val="21"/>
-        </w:rPr>
-        <w:t>percus</w:t>
-      </w:r>
-      <w:proofErr w:type="spellEnd"/>
+      <w:r>
+        <w:rPr>
+          <w:color w:val="2C2C2C"/>
+          <w:sz w:val="21"/>
+          <w:szCs w:val="21"/>
+        </w:rPr>
+        <w:t>perçus</w:t>
+      </w:r>
       <w:r>
         <w:rPr>
           <w:color w:val="2C2C2C"/>
@@ -2046,6 +2126,22 @@
         </w:rPr>
         <w:t xml:space="preserve">Le </w:t>
       </w:r>
+      <w:r>
+        <w:rPr>
+          <w:color w:val="2C2C2C"/>
+          <w:sz w:val="21"/>
+          <w:szCs w:val="21"/>
+        </w:rPr>
+        <w:t>décodeur</w:t>
+      </w:r>
+      <w:r>
+        <w:rPr>
+          <w:color w:val="2C2C2C"/>
+          <w:sz w:val="21"/>
+          <w:szCs w:val="21"/>
+        </w:rPr>
+        <w:t xml:space="preserve"> </w:t>
+      </w:r>
       <w:proofErr w:type="spellStart"/>
       <w:r>
         <w:rPr>
@@ -2053,7 +2149,7 @@
           <w:sz w:val="21"/>
           <w:szCs w:val="21"/>
         </w:rPr>
-        <w:t>decodeur</w:t>
+        <w:t>dequantifie</w:t>
       </w:r>
       <w:proofErr w:type="spellEnd"/>
       <w:r>
@@ -2062,36 +2158,16 @@
           <w:sz w:val="21"/>
           <w:szCs w:val="21"/>
         </w:rPr>
-        <w:t xml:space="preserve"> </w:t>
-      </w:r>
-      <w:proofErr w:type="spellStart"/>
-      <w:r>
-        <w:rPr>
-          <w:color w:val="2C2C2C"/>
-          <w:sz w:val="21"/>
-          <w:szCs w:val="21"/>
-        </w:rPr>
-        <w:t>dequantifie</w:t>
-      </w:r>
-      <w:proofErr w:type="spellEnd"/>
-      <w:r>
-        <w:rPr>
-          <w:color w:val="2C2C2C"/>
-          <w:sz w:val="21"/>
-          <w:szCs w:val="21"/>
-        </w:rPr>
         <w:t xml:space="preserve"> (multiplie par la </w:t>
       </w:r>
-      <w:proofErr w:type="spellStart"/>
-      <w:r>
-        <w:rPr>
-          <w:color w:val="2C2C2C"/>
-          <w:sz w:val="21"/>
-          <w:szCs w:val="21"/>
-        </w:rPr>
-        <w:t>meme</w:t>
-      </w:r>
-      <w:proofErr w:type="spellEnd"/>
+      <w:r>
+        <w:rPr>
+          <w:color w:val="2C2C2C"/>
+          <w:sz w:val="21"/>
+          <w:szCs w:val="21"/>
+        </w:rPr>
+        <w:t>même</w:t>
+      </w:r>
       <w:r>
         <w:rPr>
           <w:color w:val="2C2C2C"/>
@@ -2135,37 +2211,65 @@
       <w:pPr>
         <w:spacing w:before="80"/>
       </w:pPr>
-    </w:p>
-    <w:p>
-      <w:pPr>
-        <w:pStyle w:val="Titre2"/>
-      </w:pPr>
-      <w:r>
-        <w:lastRenderedPageBreak/>
-        <w:t>Etape 3</w:t>
-      </w:r>
-      <w:r>
-        <w:t>)</w:t>
-      </w:r>
-      <w:r>
-        <w:t xml:space="preserve"> Codage Inter-trames (P-frames) : Estimation de mouvement et codage du </w:t>
-      </w:r>
-      <w:proofErr w:type="spellStart"/>
-      <w:r>
-        <w:t>residu</w:t>
-      </w:r>
-      <w:proofErr w:type="spellEnd"/>
     </w:p>
     <w:p>
       <w:pPr>
         <w:spacing w:before="60" w:after="80"/>
         <w:jc w:val="both"/>
-      </w:pPr>
-      <w:r>
-        <w:rPr>
-          <w:color w:val="2C2C2C"/>
-        </w:rPr>
-        <w:t xml:space="preserve">Toutes les trames qui ne sont pas des I-frames sont </w:t>
+        <w:rPr>
+          <w:color w:val="2C2C2C"/>
+        </w:rPr>
+      </w:pPr>
+    </w:p>
+    <w:p>
+      <w:pPr>
+        <w:pStyle w:val="Titre2"/>
+        <w:rPr>
+          <w:color w:val="215E99" w:themeColor="text2" w:themeTint="BF"/>
+        </w:rPr>
+      </w:pPr>
+      <w:r>
+        <w:rPr>
+          <w:color w:val="215E99" w:themeColor="text2" w:themeTint="BF"/>
+        </w:rPr>
+        <w:lastRenderedPageBreak/>
+        <w:t>Et</w:t>
+      </w:r>
+      <w:r>
+        <w:rPr>
+          <w:color w:val="215E99" w:themeColor="text2" w:themeTint="BF"/>
+        </w:rPr>
+        <w:t xml:space="preserve">ape 3) Codage Inter-trames (P-frames) : Estimation de mouvement et codage du </w:t>
+      </w:r>
+      <w:r>
+        <w:rPr>
+          <w:color w:val="215E99" w:themeColor="text2" w:themeTint="BF"/>
+        </w:rPr>
+        <w:t>résidu</w:t>
+      </w:r>
+      <w:r>
+        <w:rPr>
+          <w:color w:val="215E99" w:themeColor="text2" w:themeTint="BF"/>
+        </w:rPr>
+        <w:t> :</w:t>
+      </w:r>
+    </w:p>
+    <w:p>
+      <w:pPr>
+        <w:spacing w:before="60" w:after="80"/>
+        <w:jc w:val="both"/>
+      </w:pPr>
+      <w:r>
+        <w:rPr>
+          <w:color w:val="2C2C2C"/>
+        </w:rPr>
+        <w:t>T</w:t>
+      </w:r>
+      <w:r>
+        <w:rPr>
+          <w:color w:val="2C2C2C"/>
+        </w:rPr>
+        <w:t xml:space="preserve">outes les trames qui ne sont pas des I-frames sont </w:t>
       </w:r>
       <w:proofErr w:type="spellStart"/>
       <w:r>
@@ -2225,7 +2329,25 @@
           <w:sz w:val="21"/>
           <w:szCs w:val="21"/>
         </w:rPr>
-        <w:t>Le plan de luminance est partitionne en macroblocs 16x16.</w:t>
+        <w:t xml:space="preserve">Le plan de luminance est </w:t>
+      </w:r>
+      <w:proofErr w:type="gramStart"/>
+      <w:r>
+        <w:rPr>
+          <w:color w:val="2C2C2C"/>
+          <w:sz w:val="21"/>
+          <w:szCs w:val="21"/>
+        </w:rPr>
+        <w:t>partitionne</w:t>
+      </w:r>
+      <w:proofErr w:type="gramEnd"/>
+      <w:r>
+        <w:rPr>
+          <w:color w:val="2C2C2C"/>
+          <w:sz w:val="21"/>
+          <w:szCs w:val="21"/>
+        </w:rPr>
+        <w:t xml:space="preserve"> en macroblocs 16x16.</w:t>
       </w:r>
     </w:p>
     <w:p>
@@ -2552,6 +2674,7 @@
         <w:t xml:space="preserve"> en mouvement </w:t>
       </w:r>
       <w:proofErr w:type="spellStart"/>
+      <w:proofErr w:type="gramStart"/>
       <w:r>
         <w:rPr>
           <w:color w:val="2C2C2C"/>
@@ -2561,6 +2684,7 @@
         <w:t>a</w:t>
       </w:r>
       <w:proofErr w:type="spellEnd"/>
+      <w:proofErr w:type="gramEnd"/>
       <w:r>
         <w:rPr>
           <w:color w:val="2C2C2C"/>
@@ -2592,25 +2716,66 @@
       <w:pPr>
         <w:spacing w:before="80"/>
       </w:pPr>
-    </w:p>
-    <w:p>
-      <w:pPr>
-        <w:pStyle w:val="Titre2"/>
-      </w:pPr>
-      <w:r>
-        <w:t>Etape 4</w:t>
-      </w:r>
-      <w:r>
-        <w:t xml:space="preserve"> )</w:t>
-      </w:r>
-      <w:r>
-        <w:t xml:space="preserve"> Codage Entropique : Emballage du flux binaire et compression bz2</w:t>
-      </w:r>
     </w:p>
     <w:p>
       <w:pPr>
         <w:spacing w:before="60" w:after="80"/>
         <w:jc w:val="both"/>
+        <w:rPr>
+          <w:b/>
+          <w:bCs/>
+          <w:color w:val="215E99" w:themeColor="text2" w:themeTint="BF"/>
+          <w:sz w:val="24"/>
+          <w:szCs w:val="24"/>
+        </w:rPr>
+      </w:pPr>
+      <w:r>
+        <w:rPr>
+          <w:b/>
+          <w:bCs/>
+          <w:color w:val="215E99" w:themeColor="text2" w:themeTint="BF"/>
+          <w:sz w:val="24"/>
+          <w:szCs w:val="24"/>
+        </w:rPr>
+        <w:t>E</w:t>
+      </w:r>
+      <w:r>
+        <w:rPr>
+          <w:b/>
+          <w:bCs/>
+          <w:color w:val="215E99" w:themeColor="text2" w:themeTint="BF"/>
+          <w:sz w:val="24"/>
+          <w:szCs w:val="24"/>
+        </w:rPr>
+        <w:t xml:space="preserve">tape </w:t>
+      </w:r>
+      <w:proofErr w:type="gramStart"/>
+      <w:r>
+        <w:rPr>
+          <w:b/>
+          <w:bCs/>
+          <w:color w:val="215E99" w:themeColor="text2" w:themeTint="BF"/>
+          <w:sz w:val="24"/>
+          <w:szCs w:val="24"/>
+        </w:rPr>
+        <w:t>4 )</w:t>
+      </w:r>
+      <w:proofErr w:type="gramEnd"/>
+      <w:r>
+        <w:rPr>
+          <w:b/>
+          <w:bCs/>
+          <w:color w:val="215E99" w:themeColor="text2" w:themeTint="BF"/>
+          <w:sz w:val="24"/>
+          <w:szCs w:val="24"/>
+        </w:rPr>
+        <w:t xml:space="preserve"> Codage Entropique : Emballage du flux binaire et compression bz2</w:t>
+      </w:r>
+    </w:p>
+    <w:p>
+      <w:pPr>
+        <w:spacing w:before="60" w:after="80"/>
+        <w:jc w:val="both"/>
       </w:pPr>
       <w:r>
         <w:rPr>
@@ -2628,7 +2793,21 @@
         <w:rPr>
           <w:color w:val="2C2C2C"/>
         </w:rPr>
-        <w:t xml:space="preserve">, les tableaux de coefficients quantifies et les vecteurs de mouvement de chaque trame sont </w:t>
+        <w:t xml:space="preserve">, les tableaux de coefficients </w:t>
+      </w:r>
+      <w:proofErr w:type="gramStart"/>
+      <w:r>
+        <w:rPr>
+          <w:color w:val="2C2C2C"/>
+        </w:rPr>
+        <w:t>quantifies</w:t>
+      </w:r>
+      <w:proofErr w:type="gramEnd"/>
+      <w:r>
+        <w:rPr>
+          <w:color w:val="2C2C2C"/>
+        </w:rPr>
+        <w:t xml:space="preserve"> et les vecteurs de mouvement de chaque trame sont </w:t>
       </w:r>
       <w:proofErr w:type="spellStart"/>
       <w:r>
@@ -2750,15 +2929,55 @@
     </w:p>
     <w:p>
       <w:pPr>
-        <w:pStyle w:val="Titre2"/>
-      </w:pPr>
-      <w:r>
-        <w:t xml:space="preserve">Etape 5 </w:t>
-      </w:r>
-      <w:r>
-        <w:t>)</w:t>
-      </w:r>
-      <w:r>
+        <w:spacing w:before="80"/>
+        <w:rPr>
+          <w:b/>
+          <w:bCs/>
+          <w:color w:val="215E99" w:themeColor="text2" w:themeTint="BF"/>
+          <w:sz w:val="24"/>
+          <w:szCs w:val="24"/>
+        </w:rPr>
+      </w:pPr>
+      <w:r>
+        <w:rPr>
+          <w:b/>
+          <w:bCs/>
+          <w:color w:val="215E99" w:themeColor="text2" w:themeTint="BF"/>
+          <w:sz w:val="24"/>
+          <w:szCs w:val="24"/>
+        </w:rPr>
+        <w:t>E</w:t>
+      </w:r>
+      <w:r>
+        <w:rPr>
+          <w:b/>
+          <w:bCs/>
+          <w:color w:val="215E99" w:themeColor="text2" w:themeTint="BF"/>
+          <w:sz w:val="24"/>
+          <w:szCs w:val="24"/>
+        </w:rPr>
+        <w:t xml:space="preserve">tape </w:t>
+      </w:r>
+      <w:proofErr w:type="gramStart"/>
+      <w:r>
+        <w:rPr>
+          <w:b/>
+          <w:bCs/>
+          <w:color w:val="215E99" w:themeColor="text2" w:themeTint="BF"/>
+          <w:sz w:val="24"/>
+          <w:szCs w:val="24"/>
+        </w:rPr>
+        <w:t>5 )</w:t>
+      </w:r>
+      <w:proofErr w:type="gramEnd"/>
+      <w:r>
+        <w:rPr>
+          <w:b/>
+          <w:bCs/>
+          <w:color w:val="215E99" w:themeColor="text2" w:themeTint="BF"/>
+          <w:sz w:val="24"/>
+          <w:szCs w:val="24"/>
+        </w:rPr>
         <w:t xml:space="preserve"> Evaluation et Visualisation</w:t>
       </w:r>
     </w:p>
@@ -3085,14 +3304,55 @@
     </w:p>
     <w:p>
       <w:pPr>
-        <w:pStyle w:val="Titre1"/>
-        <w:pBdr>
-          <w:bottom w:val="single" w:sz="6" w:space="4" w:color="E94560"/>
-        </w:pBdr>
-      </w:pPr>
-      <w:r>
+        <w:spacing w:before="100"/>
+      </w:pPr>
+    </w:p>
+    <w:p>
+      <w:pPr>
+        <w:spacing w:before="60"/>
+      </w:pPr>
+    </w:p>
+    <w:p>
+      <w:pPr>
+        <w:spacing w:before="60"/>
+        <w:rPr>
+          <w:b/>
+          <w:bCs/>
+          <w:color w:val="215E99" w:themeColor="text2" w:themeTint="BF"/>
+          <w:sz w:val="28"/>
+          <w:szCs w:val="28"/>
+        </w:rPr>
+      </w:pPr>
+      <w:r>
+        <w:rPr>
+          <w:b/>
+          <w:bCs/>
+          <w:color w:val="215E99" w:themeColor="text2" w:themeTint="BF"/>
+          <w:sz w:val="28"/>
+          <w:szCs w:val="28"/>
+        </w:rPr>
         <w:lastRenderedPageBreak/>
-        <w:t>b) Choix de Conception et Justification</w:t>
+        <w:t xml:space="preserve">b) </w:t>
+      </w:r>
+      <w:r>
+        <w:rPr>
+          <w:b/>
+          <w:bCs/>
+          <w:color w:val="215E99" w:themeColor="text2" w:themeTint="BF"/>
+          <w:sz w:val="28"/>
+          <w:szCs w:val="28"/>
+        </w:rPr>
+        <w:t>Choix de Conception et Justification</w:t>
+      </w:r>
+      <w:r>
+        <w:rPr>
+          <w:b/>
+          <w:bCs/>
+          <w:color w:val="215E99" w:themeColor="text2" w:themeTint="BF"/>
+          <w:sz w:val="28"/>
+          <w:szCs w:val="28"/>
+        </w:rPr>
+        <w:t> :</w:t>
       </w:r>
     </w:p>
     <w:p>
@@ -3122,12 +3382,6 @@
         <w:gridCol w:w="6226"/>
       </w:tblGrid>
       <w:tr>
-        <w:tblPrEx>
-          <w:tblCellMar>
-            <w:top w:w="0" w:type="dxa"/>
-            <w:bottom w:w="0" w:type="dxa"/>
-          </w:tblCellMar>
-        </w:tblPrEx>
         <w:tc>
           <w:tcPr>
             <w:tcW w:w="2800" w:type="dxa"/>
@@ -3198,12 +3452,6 @@
         </w:tc>
       </w:tr>
       <w:tr>
-        <w:tblPrEx>
-          <w:tblCellMar>
-            <w:top w:w="0" w:type="dxa"/>
-            <w:bottom w:w="0" w:type="dxa"/>
-          </w:tblCellMar>
-        </w:tblPrEx>
         <w:tc>
           <w:tcPr>
             <w:tcW w:w="2800" w:type="dxa"/>
@@ -3247,7 +3495,29 @@
                 <w:sz w:val="20"/>
                 <w:szCs w:val="20"/>
               </w:rPr>
-              <w:t xml:space="preserve"> + 4:2:0</w:t>
+              <w:t xml:space="preserve"> + </w:t>
+            </w:r>
+            <w:proofErr w:type="gramStart"/>
+            <w:r>
+              <w:rPr>
+                <w:b/>
+                <w:bCs/>
+                <w:color w:val="2C2C2C"/>
+                <w:sz w:val="20"/>
+                <w:szCs w:val="20"/>
+              </w:rPr>
+              <w:t>4:2:</w:t>
+            </w:r>
+            <w:proofErr w:type="gramEnd"/>
+            <w:r>
+              <w:rPr>
+                <w:b/>
+                <w:bCs/>
+                <w:color w:val="2C2C2C"/>
+                <w:sz w:val="20"/>
+                <w:szCs w:val="20"/>
+              </w:rPr>
+              <w:t>0</w:t>
             </w:r>
           </w:p>
         </w:tc>
@@ -3411,12 +3681,6 @@
         </w:tc>
       </w:tr>
       <w:tr>
-        <w:tblPrEx>
-          <w:tblCellMar>
-            <w:top w:w="0" w:type="dxa"/>
-            <w:bottom w:w="0" w:type="dxa"/>
-          </w:tblCellMar>
-        </w:tblPrEx>
         <w:tc>
           <w:tcPr>
             <w:tcW w:w="2800" w:type="dxa"/>
@@ -3549,6 +3813,7 @@
               <w:t xml:space="preserve"> BLAS, correspondant </w:t>
             </w:r>
             <w:proofErr w:type="spellStart"/>
+            <w:proofErr w:type="gramStart"/>
             <w:r>
               <w:rPr>
                 <w:color w:val="2C2C2C"/>
@@ -3558,6 +3823,7 @@
               <w:t>a</w:t>
             </w:r>
             <w:proofErr w:type="spellEnd"/>
+            <w:proofErr w:type="gramEnd"/>
             <w:r>
               <w:rPr>
                 <w:color w:val="2C2C2C"/>
@@ -3660,12 +3926,6 @@
         </w:tc>
       </w:tr>
       <w:tr>
-        <w:tblPrEx>
-          <w:tblCellMar>
-            <w:top w:w="0" w:type="dxa"/>
-            <w:bottom w:w="0" w:type="dxa"/>
-          </w:tblCellMar>
-        </w:tblPrEx>
         <w:tc>
           <w:tcPr>
             <w:tcW w:w="2800" w:type="dxa"/>
@@ -3971,12 +4231,6 @@
         </w:tc>
       </w:tr>
       <w:tr>
-        <w:tblPrEx>
-          <w:tblCellMar>
-            <w:top w:w="0" w:type="dxa"/>
-            <w:bottom w:w="0" w:type="dxa"/>
-          </w:tblCellMar>
-        </w:tblPrEx>
         <w:tc>
           <w:tcPr>
             <w:tcW w:w="2800" w:type="dxa"/>
@@ -4076,7 +4330,43 @@
                 <w:sz w:val="20"/>
                 <w:szCs w:val="20"/>
               </w:rPr>
-              <w:t xml:space="preserve"> cela a O(log S) en effectuant trois tours de recherches </w:t>
+              <w:t xml:space="preserve"> cela </w:t>
+            </w:r>
+            <w:proofErr w:type="gramStart"/>
+            <w:r>
+              <w:rPr>
+                <w:color w:val="2C2C2C"/>
+                <w:sz w:val="20"/>
+                <w:szCs w:val="20"/>
+              </w:rPr>
+              <w:t>a</w:t>
+            </w:r>
+            <w:proofErr w:type="gramEnd"/>
+            <w:r>
+              <w:rPr>
+                <w:color w:val="2C2C2C"/>
+                <w:sz w:val="20"/>
+                <w:szCs w:val="20"/>
+              </w:rPr>
+              <w:t xml:space="preserve"> </w:t>
+            </w:r>
+            <w:proofErr w:type="gramStart"/>
+            <w:r>
+              <w:rPr>
+                <w:color w:val="2C2C2C"/>
+                <w:sz w:val="20"/>
+                <w:szCs w:val="20"/>
+              </w:rPr>
+              <w:t>O(</w:t>
+            </w:r>
+            <w:proofErr w:type="gramEnd"/>
+            <w:r>
+              <w:rPr>
+                <w:color w:val="2C2C2C"/>
+                <w:sz w:val="20"/>
+                <w:szCs w:val="20"/>
+              </w:rPr>
+              <w:t xml:space="preserve">log S) en effectuant trois tours de recherches </w:t>
             </w:r>
             <w:proofErr w:type="spellStart"/>
             <w:r>
@@ -4094,7 +4384,25 @@
                 <w:sz w:val="20"/>
                 <w:szCs w:val="20"/>
               </w:rPr>
-              <w:t xml:space="preserve"> a fines a 9 points, perdant peu d'</w:t>
+              <w:t xml:space="preserve"> a fines </w:t>
+            </w:r>
+            <w:proofErr w:type="gramStart"/>
+            <w:r>
+              <w:rPr>
+                <w:color w:val="2C2C2C"/>
+                <w:sz w:val="20"/>
+                <w:szCs w:val="20"/>
+              </w:rPr>
+              <w:t>a</w:t>
+            </w:r>
+            <w:proofErr w:type="gramEnd"/>
+            <w:r>
+              <w:rPr>
+                <w:color w:val="2C2C2C"/>
+                <w:sz w:val="20"/>
+                <w:szCs w:val="20"/>
+              </w:rPr>
+              <w:t xml:space="preserve"> 9 points, perdant peu d'</w:t>
             </w:r>
             <w:proofErr w:type="spellStart"/>
             <w:r>
@@ -4136,12 +4444,6 @@
         </w:tc>
       </w:tr>
       <w:tr>
-        <w:tblPrEx>
-          <w:tblCellMar>
-            <w:top w:w="0" w:type="dxa"/>
-            <w:bottom w:w="0" w:type="dxa"/>
-          </w:tblCellMar>
-        </w:tblPrEx>
         <w:tc>
           <w:tcPr>
             <w:tcW w:w="2800" w:type="dxa"/>
@@ -4165,6 +4467,7 @@
               <w:spacing w:before="60" w:after="80"/>
               <w:jc w:val="both"/>
             </w:pPr>
+            <w:proofErr w:type="gramStart"/>
             <w:r>
               <w:rPr>
                 <w:b/>
@@ -4173,7 +4476,18 @@
                 <w:sz w:val="20"/>
                 <w:szCs w:val="20"/>
               </w:rPr>
-              <w:t xml:space="preserve">bz2 (BWT) au lieu de </w:t>
+              <w:t>bz</w:t>
+            </w:r>
+            <w:proofErr w:type="gramEnd"/>
+            <w:r>
+              <w:rPr>
+                <w:b/>
+                <w:bCs/>
+                <w:color w:val="2C2C2C"/>
+                <w:sz w:val="20"/>
+                <w:szCs w:val="20"/>
+              </w:rPr>
+              <w:t xml:space="preserve">2 (BWT) au lieu de </w:t>
             </w:r>
             <w:proofErr w:type="spellStart"/>
             <w:r>
@@ -4323,12 +4637,6 @@
         </w:tc>
       </w:tr>
       <w:tr>
-        <w:tblPrEx>
-          <w:tblCellMar>
-            <w:top w:w="0" w:type="dxa"/>
-            <w:bottom w:w="0" w:type="dxa"/>
-          </w:tblCellMar>
-        </w:tblPrEx>
         <w:tc>
           <w:tcPr>
             <w:tcW w:w="2800" w:type="dxa"/>
@@ -4449,6 +4757,7 @@
               <w:t xml:space="preserve"> en C ou tout autre langage pourrait analyser le format </w:t>
             </w:r>
             <w:proofErr w:type="spellStart"/>
+            <w:proofErr w:type="gramStart"/>
             <w:r>
               <w:rPr>
                 <w:color w:val="2C2C2C"/>
@@ -4458,6 +4767,7 @@
               <w:t>a</w:t>
             </w:r>
             <w:proofErr w:type="spellEnd"/>
+            <w:proofErr w:type="gramEnd"/>
             <w:r>
               <w:rPr>
                 <w:color w:val="2C2C2C"/>
@@ -4488,12 +4798,6 @@
         </w:tc>
       </w:tr>
       <w:tr>
-        <w:tblPrEx>
-          <w:tblCellMar>
-            <w:top w:w="0" w:type="dxa"/>
-            <w:bottom w:w="0" w:type="dxa"/>
-          </w:tblCellMar>
-        </w:tblPrEx>
         <w:tc>
           <w:tcPr>
             <w:tcW w:w="2800" w:type="dxa"/>
@@ -4730,27 +5034,72 @@
     </w:p>
     <w:p>
       <w:pPr>
-        <w:pStyle w:val="Titre1"/>
-        <w:pBdr>
-          <w:bottom w:val="single" w:sz="6" w:space="4" w:color="E94560"/>
-        </w:pBdr>
-      </w:pPr>
-      <w:r>
-        <w:lastRenderedPageBreak/>
-        <w:t>C</w:t>
-      </w:r>
-      <w:r>
-        <w:t xml:space="preserve">) Analyse </w:t>
-      </w:r>
-      <w:proofErr w:type="spellStart"/>
-      <w:r>
-        <w:t>Experimentale</w:t>
-      </w:r>
-      <w:proofErr w:type="spellEnd"/>
-    </w:p>
-    <w:p>
-      <w:pPr>
         <w:spacing w:before="60" w:after="80"/>
+        <w:ind w:left="360"/>
+        <w:jc w:val="both"/>
+        <w:rPr>
+          <w:color w:val="2C2C2C"/>
+        </w:rPr>
+      </w:pPr>
+    </w:p>
+    <w:p>
+      <w:pPr>
+        <w:spacing w:before="60" w:after="80"/>
+        <w:ind w:left="360"/>
+        <w:jc w:val="both"/>
+        <w:rPr>
+          <w:color w:val="2C2C2C"/>
+        </w:rPr>
+      </w:pPr>
+    </w:p>
+    <w:p>
+      <w:pPr>
+        <w:spacing w:before="60" w:after="80"/>
+        <w:ind w:left="360"/>
+        <w:jc w:val="both"/>
+        <w:rPr>
+          <w:b/>
+          <w:bCs/>
+          <w:color w:val="215E99" w:themeColor="text2" w:themeTint="BF"/>
+          <w:sz w:val="28"/>
+          <w:szCs w:val="28"/>
+        </w:rPr>
+      </w:pPr>
+      <w:r>
+        <w:rPr>
+          <w:b/>
+          <w:bCs/>
+          <w:color w:val="215E99" w:themeColor="text2" w:themeTint="BF"/>
+          <w:sz w:val="28"/>
+          <w:szCs w:val="28"/>
+        </w:rPr>
+        <w:t xml:space="preserve">C) </w:t>
+      </w:r>
+      <w:r>
+        <w:rPr>
+          <w:b/>
+          <w:bCs/>
+          <w:color w:val="215E99" w:themeColor="text2" w:themeTint="BF"/>
+          <w:sz w:val="28"/>
+          <w:szCs w:val="28"/>
+        </w:rPr>
+        <w:t>Analyse Expérimentale</w:t>
+      </w:r>
+      <w:r>
+        <w:rPr>
+          <w:b/>
+          <w:bCs/>
+          <w:color w:val="215E99" w:themeColor="text2" w:themeTint="BF"/>
+          <w:sz w:val="28"/>
+          <w:szCs w:val="28"/>
+        </w:rPr>
+        <w:t> :</w:t>
+      </w:r>
+    </w:p>
+    <w:p>
+      <w:pPr>
+        <w:spacing w:before="60" w:after="80"/>
+        <w:ind w:left="360"/>
         <w:jc w:val="both"/>
       </w:pPr>
       <w:r>
@@ -4802,6 +5151,7 @@
         <w:spacing w:before="40" w:after="40"/>
         <w:ind w:left="360"/>
       </w:pPr>
+      <w:proofErr w:type="gramStart"/>
       <w:r>
         <w:rPr>
           <w:rFonts w:ascii="Courier New" w:eastAsia="Courier New" w:hAnsi="Courier New" w:cs="Courier New"/>
@@ -4809,9 +5159,9 @@
           <w:sz w:val="18"/>
           <w:szCs w:val="18"/>
         </w:rPr>
-        <w:t xml:space="preserve">python run.py </w:t>
-      </w:r>
-      <w:proofErr w:type="spellStart"/>
+        <w:t>python</w:t>
+      </w:r>
+      <w:proofErr w:type="gramEnd"/>
       <w:r>
         <w:rPr>
           <w:rFonts w:ascii="Courier New" w:eastAsia="Courier New" w:hAnsi="Courier New" w:cs="Courier New"/>
@@ -4819,9 +5169,9 @@
           <w:sz w:val="18"/>
           <w:szCs w:val="18"/>
         </w:rPr>
-        <w:t>sweep</w:t>
-      </w:r>
-      <w:proofErr w:type="spellEnd"/>
+        <w:t xml:space="preserve"> run.py </w:t>
+      </w:r>
+      <w:proofErr w:type="spellStart"/>
       <w:r>
         <w:rPr>
           <w:rFonts w:ascii="Courier New" w:eastAsia="Courier New" w:hAnsi="Courier New" w:cs="Courier New"/>
@@ -4829,9 +5179,9 @@
           <w:sz w:val="18"/>
           <w:szCs w:val="18"/>
         </w:rPr>
-        <w:t xml:space="preserve"> </w:t>
-      </w:r>
-      <w:proofErr w:type="spellStart"/>
+        <w:t>sweep</w:t>
+      </w:r>
+      <w:proofErr w:type="spellEnd"/>
       <w:r>
         <w:rPr>
           <w:rFonts w:ascii="Courier New" w:eastAsia="Courier New" w:hAnsi="Courier New" w:cs="Courier New"/>
@@ -4839,9 +5189,9 @@
           <w:sz w:val="18"/>
           <w:szCs w:val="18"/>
         </w:rPr>
-        <w:t>sample_frames</w:t>
-      </w:r>
-      <w:proofErr w:type="spellEnd"/>
+        <w:t xml:space="preserve"> </w:t>
+      </w:r>
+      <w:proofErr w:type="spellStart"/>
       <w:r>
         <w:rPr>
           <w:rFonts w:ascii="Courier New" w:eastAsia="Courier New" w:hAnsi="Courier New" w:cs="Courier New"/>
@@ -4849,12 +5199,23 @@
           <w:sz w:val="18"/>
           <w:szCs w:val="18"/>
         </w:rPr>
+        <w:t>sample_frames</w:t>
+      </w:r>
+      <w:proofErr w:type="spellEnd"/>
+      <w:r>
+        <w:rPr>
+          <w:rFonts w:ascii="Courier New" w:eastAsia="Courier New" w:hAnsi="Courier New" w:cs="Courier New"/>
+          <w:color w:val="1A1A2E"/>
+          <w:sz w:val="18"/>
+          <w:szCs w:val="18"/>
+        </w:rPr>
         <w:t xml:space="preserve"> -o experiments.png</w:t>
       </w:r>
     </w:p>
     <w:p>
       <w:pPr>
         <w:spacing w:before="60" w:after="80"/>
+        <w:ind w:left="360"/>
         <w:jc w:val="both"/>
       </w:pPr>
       <w:r>
@@ -4908,6 +5269,7 @@
     <w:p>
       <w:pPr>
         <w:spacing w:before="100" w:after="60"/>
+        <w:ind w:left="360"/>
         <w:jc w:val="center"/>
       </w:pPr>
       <w:r>
@@ -4957,6 +5319,7 @@
     <w:p>
       <w:pPr>
         <w:spacing w:after="120"/>
+        <w:ind w:left="360"/>
         <w:jc w:val="center"/>
       </w:pPr>
       <w:r>
@@ -4997,7 +5360,10 @@
         <w:pStyle w:val="Titre2"/>
       </w:pPr>
       <w:r>
-        <w:t xml:space="preserve">Taux de Compression vs Facteur </w:t>
+        <w:t>T</w:t>
+      </w:r>
+      <w:r>
+        <w:t xml:space="preserve">aux de Compression vs Facteur </w:t>
       </w:r>
       <w:r>
         <w:t>Qualité</w:t>
@@ -5316,6 +5682,7 @@
         <w:t xml:space="preserve"> 90, le ratio tombe </w:t>
       </w:r>
       <w:proofErr w:type="spellStart"/>
+      <w:proofErr w:type="gramStart"/>
       <w:r>
         <w:rPr>
           <w:color w:val="2C2C2C"/>
@@ -5325,6 +5692,7 @@
         <w:t>a</w:t>
       </w:r>
       <w:proofErr w:type="spellEnd"/>
+      <w:proofErr w:type="gramEnd"/>
       <w:r>
         <w:rPr>
           <w:color w:val="2C2C2C"/>
@@ -5610,7 +5978,25 @@
           <w:sz w:val="21"/>
           <w:szCs w:val="21"/>
         </w:rPr>
-        <w:t xml:space="preserve">GOP=2 : ratio saute a environ 53x. </w:t>
+        <w:t xml:space="preserve">GOP=2 : ratio saute </w:t>
+      </w:r>
+      <w:proofErr w:type="gramStart"/>
+      <w:r>
+        <w:rPr>
+          <w:color w:val="2C2C2C"/>
+          <w:sz w:val="21"/>
+          <w:szCs w:val="21"/>
+        </w:rPr>
+        <w:t>a</w:t>
+      </w:r>
+      <w:proofErr w:type="gramEnd"/>
+      <w:r>
+        <w:rPr>
+          <w:color w:val="2C2C2C"/>
+          <w:sz w:val="21"/>
+          <w:szCs w:val="21"/>
+        </w:rPr>
+        <w:t xml:space="preserve"> environ 53x. </w:t>
       </w:r>
       <w:r>
         <w:rPr>
@@ -5681,6 +6067,7 @@
         <w:t xml:space="preserve">GOP=8 : ratio environ 59x. La courbe commence </w:t>
       </w:r>
       <w:proofErr w:type="spellStart"/>
+      <w:proofErr w:type="gramStart"/>
       <w:r>
         <w:rPr>
           <w:color w:val="2C2C2C"/>
@@ -5690,6 +6077,7 @@
         <w:t>a</w:t>
       </w:r>
       <w:proofErr w:type="spellEnd"/>
+      <w:proofErr w:type="gramEnd"/>
       <w:r>
         <w:rPr>
           <w:color w:val="2C2C2C"/>
@@ -5809,7 +6197,21 @@
         <w:rPr>
           <w:color w:val="2C2C2C"/>
         </w:rPr>
-        <w:t xml:space="preserve">La conclusion pratique est que GOP=8 offre le meilleur </w:t>
+        <w:t xml:space="preserve">La conclusion pratique est que GOP=8 </w:t>
+      </w:r>
+      <w:proofErr w:type="gramStart"/>
+      <w:r>
+        <w:rPr>
+          <w:color w:val="2C2C2C"/>
+        </w:rPr>
+        <w:t>offre</w:t>
+      </w:r>
+      <w:proofErr w:type="gramEnd"/>
+      <w:r>
+        <w:rPr>
+          <w:color w:val="2C2C2C"/>
+        </w:rPr>
+        <w:t xml:space="preserve"> le meilleur </w:t>
       </w:r>
       <w:r>
         <w:rPr>
@@ -6190,6 +6592,7 @@
         <w:ind w:left="360"/>
       </w:pPr>
       <w:proofErr w:type="spellStart"/>
+      <w:proofErr w:type="gramStart"/>
       <w:r>
         <w:rPr>
           <w:rFonts w:ascii="Courier New" w:eastAsia="Courier New" w:hAnsi="Courier New" w:cs="Courier New"/>
@@ -6200,6 +6603,7 @@
         <w:t>pip</w:t>
       </w:r>
       <w:proofErr w:type="spellEnd"/>
+      <w:proofErr w:type="gramEnd"/>
       <w:r>
         <w:rPr>
           <w:rFonts w:ascii="Courier New" w:eastAsia="Courier New" w:hAnsi="Courier New" w:cs="Courier New"/>
@@ -6290,25 +6694,7 @@
         <w:rPr>
           <w:color w:val="2C2C2C"/>
         </w:rPr>
-        <w:t>Générer</w:t>
-      </w:r>
-      <w:r>
-        <w:rPr>
-          <w:color w:val="2C2C2C"/>
-        </w:rPr>
-        <w:t xml:space="preserve"> le clip de test, encoder, </w:t>
-      </w:r>
-      <w:r>
-        <w:rPr>
-          <w:color w:val="2C2C2C"/>
-        </w:rPr>
-        <w:t>décoder</w:t>
-      </w:r>
-      <w:r>
-        <w:rPr>
-          <w:color w:val="2C2C2C"/>
-        </w:rPr>
-        <w:t>, visualiser et balayer :</w:t>
+        <w:t>Générer le clip de test, encoder, décoder, visualiser et balayer :</w:t>
       </w:r>
     </w:p>
     <w:p>
@@ -6317,6 +6703,7 @@
         <w:spacing w:before="40" w:after="40"/>
         <w:ind w:left="360"/>
       </w:pPr>
+      <w:proofErr w:type="gramStart"/>
       <w:r>
         <w:rPr>
           <w:rFonts w:ascii="Courier New" w:eastAsia="Courier New" w:hAnsi="Courier New" w:cs="Courier New"/>
@@ -6324,9 +6711,9 @@
           <w:sz w:val="18"/>
           <w:szCs w:val="18"/>
         </w:rPr>
-        <w:t xml:space="preserve">python gen_test_frames.py -o </w:t>
-      </w:r>
-      <w:proofErr w:type="spellStart"/>
+        <w:t>python</w:t>
+      </w:r>
+      <w:proofErr w:type="gramEnd"/>
       <w:r>
         <w:rPr>
           <w:rFonts w:ascii="Courier New" w:eastAsia="Courier New" w:hAnsi="Courier New" w:cs="Courier New"/>
@@ -6334,9 +6721,9 @@
           <w:sz w:val="18"/>
           <w:szCs w:val="18"/>
         </w:rPr>
-        <w:t>sample_frames</w:t>
-      </w:r>
-      <w:proofErr w:type="spellEnd"/>
+        <w:t xml:space="preserve"> gen_test_frames.py -o </w:t>
+      </w:r>
+      <w:proofErr w:type="spellStart"/>
       <w:r>
         <w:rPr>
           <w:rFonts w:ascii="Courier New" w:eastAsia="Courier New" w:hAnsi="Courier New" w:cs="Courier New"/>
@@ -6344,15 +6731,9 @@
           <w:sz w:val="18"/>
           <w:szCs w:val="18"/>
         </w:rPr>
-        <w:t xml:space="preserve"> -n 12</w:t>
-      </w:r>
-    </w:p>
-    <w:p>
-      <w:pPr>
-        <w:shd w:val="clear" w:color="auto" w:fill="F0F4F8"/>
-        <w:spacing w:before="40" w:after="40"/>
-        <w:ind w:left="360"/>
-      </w:pPr>
+        <w:t>sample_frames</w:t>
+      </w:r>
+      <w:proofErr w:type="spellEnd"/>
       <w:r>
         <w:rPr>
           <w:rFonts w:ascii="Courier New" w:eastAsia="Courier New" w:hAnsi="Courier New" w:cs="Courier New"/>
@@ -6360,9 +6741,16 @@
           <w:sz w:val="18"/>
           <w:szCs w:val="18"/>
         </w:rPr>
-        <w:t xml:space="preserve">python run.py encode </w:t>
-      </w:r>
-      <w:proofErr w:type="spellStart"/>
+        <w:t xml:space="preserve"> -n 12</w:t>
+      </w:r>
+    </w:p>
+    <w:p>
+      <w:pPr>
+        <w:shd w:val="clear" w:color="auto" w:fill="F0F4F8"/>
+        <w:spacing w:before="40" w:after="40"/>
+        <w:ind w:left="360"/>
+      </w:pPr>
+      <w:proofErr w:type="gramStart"/>
       <w:r>
         <w:rPr>
           <w:rFonts w:ascii="Courier New" w:eastAsia="Courier New" w:hAnsi="Courier New" w:cs="Courier New"/>
@@ -6370,9 +6758,9 @@
           <w:sz w:val="18"/>
           <w:szCs w:val="18"/>
         </w:rPr>
-        <w:t>sample_frames</w:t>
-      </w:r>
-      <w:proofErr w:type="spellEnd"/>
+        <w:t>python</w:t>
+      </w:r>
+      <w:proofErr w:type="gramEnd"/>
       <w:r>
         <w:rPr>
           <w:rFonts w:ascii="Courier New" w:eastAsia="Courier New" w:hAnsi="Courier New" w:cs="Courier New"/>
@@ -6380,7 +6768,7 @@
           <w:sz w:val="18"/>
           <w:szCs w:val="18"/>
         </w:rPr>
-        <w:t xml:space="preserve"> -o </w:t>
+        <w:t xml:space="preserve"> run.py encode </w:t>
       </w:r>
       <w:proofErr w:type="spellStart"/>
       <w:r>
@@ -6390,7 +6778,7 @@
           <w:sz w:val="18"/>
           <w:szCs w:val="18"/>
         </w:rPr>
-        <w:t>video.bin</w:t>
+        <w:t>sample_frames</w:t>
       </w:r>
       <w:proofErr w:type="spellEnd"/>
       <w:r>
@@ -6400,7 +6788,7 @@
           <w:sz w:val="18"/>
           <w:szCs w:val="18"/>
         </w:rPr>
-        <w:t xml:space="preserve"> --</w:t>
+        <w:t xml:space="preserve"> -o </w:t>
       </w:r>
       <w:proofErr w:type="spellStart"/>
       <w:r>
@@ -6410,7 +6798,7 @@
           <w:sz w:val="18"/>
           <w:szCs w:val="18"/>
         </w:rPr>
-        <w:t>gop</w:t>
+        <w:t>video.bin</w:t>
       </w:r>
       <w:proofErr w:type="spellEnd"/>
       <w:r>
@@ -6420,15 +6808,9 @@
           <w:sz w:val="18"/>
           <w:szCs w:val="18"/>
         </w:rPr>
-        <w:t xml:space="preserve"> 8 --q 50</w:t>
-      </w:r>
-    </w:p>
-    <w:p>
-      <w:pPr>
-        <w:shd w:val="clear" w:color="auto" w:fill="F0F4F8"/>
-        <w:spacing w:before="40" w:after="40"/>
-        <w:ind w:left="360"/>
-      </w:pPr>
+        <w:t xml:space="preserve"> --</w:t>
+      </w:r>
+      <w:proofErr w:type="spellStart"/>
       <w:r>
         <w:rPr>
           <w:rFonts w:ascii="Courier New" w:eastAsia="Courier New" w:hAnsi="Courier New" w:cs="Courier New"/>
@@ -6436,9 +6818,9 @@
           <w:sz w:val="18"/>
           <w:szCs w:val="18"/>
         </w:rPr>
-        <w:t xml:space="preserve">python run.py </w:t>
-      </w:r>
-      <w:proofErr w:type="spellStart"/>
+        <w:t>gop</w:t>
+      </w:r>
+      <w:proofErr w:type="spellEnd"/>
       <w:r>
         <w:rPr>
           <w:rFonts w:ascii="Courier New" w:eastAsia="Courier New" w:hAnsi="Courier New" w:cs="Courier New"/>
@@ -6446,9 +6828,16 @@
           <w:sz w:val="18"/>
           <w:szCs w:val="18"/>
         </w:rPr>
-        <w:t>decode</w:t>
-      </w:r>
-      <w:proofErr w:type="spellEnd"/>
+        <w:t xml:space="preserve"> 8 --q 50</w:t>
+      </w:r>
+    </w:p>
+    <w:p>
+      <w:pPr>
+        <w:shd w:val="clear" w:color="auto" w:fill="F0F4F8"/>
+        <w:spacing w:before="40" w:after="40"/>
+        <w:ind w:left="360"/>
+      </w:pPr>
+      <w:proofErr w:type="gramStart"/>
       <w:r>
         <w:rPr>
           <w:rFonts w:ascii="Courier New" w:eastAsia="Courier New" w:hAnsi="Courier New" w:cs="Courier New"/>
@@ -6456,9 +6845,9 @@
           <w:sz w:val="18"/>
           <w:szCs w:val="18"/>
         </w:rPr>
-        <w:t xml:space="preserve"> </w:t>
-      </w:r>
-      <w:proofErr w:type="spellStart"/>
+        <w:t>python</w:t>
+      </w:r>
+      <w:proofErr w:type="gramEnd"/>
       <w:r>
         <w:rPr>
           <w:rFonts w:ascii="Courier New" w:eastAsia="Courier New" w:hAnsi="Courier New" w:cs="Courier New"/>
@@ -6466,9 +6855,9 @@
           <w:sz w:val="18"/>
           <w:szCs w:val="18"/>
         </w:rPr>
-        <w:t>video.bin</w:t>
-      </w:r>
-      <w:proofErr w:type="spellEnd"/>
+        <w:t xml:space="preserve"> run.py </w:t>
+      </w:r>
+      <w:proofErr w:type="spellStart"/>
       <w:r>
         <w:rPr>
           <w:rFonts w:ascii="Courier New" w:eastAsia="Courier New" w:hAnsi="Courier New" w:cs="Courier New"/>
@@ -6476,9 +6865,9 @@
           <w:sz w:val="18"/>
           <w:szCs w:val="18"/>
         </w:rPr>
-        <w:t xml:space="preserve"> -o </w:t>
-      </w:r>
-      <w:proofErr w:type="spellStart"/>
+        <w:t>decode</w:t>
+      </w:r>
+      <w:proofErr w:type="spellEnd"/>
       <w:r>
         <w:rPr>
           <w:rFonts w:ascii="Courier New" w:eastAsia="Courier New" w:hAnsi="Courier New" w:cs="Courier New"/>
@@ -6486,9 +6875,9 @@
           <w:sz w:val="18"/>
           <w:szCs w:val="18"/>
         </w:rPr>
-        <w:t>decoded</w:t>
-      </w:r>
-      <w:proofErr w:type="spellEnd"/>
+        <w:t xml:space="preserve"> </w:t>
+      </w:r>
+      <w:proofErr w:type="spellStart"/>
       <w:r>
         <w:rPr>
           <w:rFonts w:ascii="Courier New" w:eastAsia="Courier New" w:hAnsi="Courier New" w:cs="Courier New"/>
@@ -6496,9 +6885,9 @@
           <w:sz w:val="18"/>
           <w:szCs w:val="18"/>
         </w:rPr>
-        <w:t xml:space="preserve"> --</w:t>
-      </w:r>
-      <w:proofErr w:type="spellStart"/>
+        <w:t>video.bin</w:t>
+      </w:r>
+      <w:proofErr w:type="spellEnd"/>
       <w:r>
         <w:rPr>
           <w:rFonts w:ascii="Courier New" w:eastAsia="Courier New" w:hAnsi="Courier New" w:cs="Courier New"/>
@@ -6506,9 +6895,9 @@
           <w:sz w:val="18"/>
           <w:szCs w:val="18"/>
         </w:rPr>
-        <w:t>ref</w:t>
-      </w:r>
-      <w:proofErr w:type="spellEnd"/>
+        <w:t xml:space="preserve"> -o </w:t>
+      </w:r>
+      <w:proofErr w:type="spellStart"/>
       <w:r>
         <w:rPr>
           <w:rFonts w:ascii="Courier New" w:eastAsia="Courier New" w:hAnsi="Courier New" w:cs="Courier New"/>
@@ -6516,9 +6905,9 @@
           <w:sz w:val="18"/>
           <w:szCs w:val="18"/>
         </w:rPr>
-        <w:t xml:space="preserve"> </w:t>
-      </w:r>
-      <w:proofErr w:type="spellStart"/>
+        <w:t>decoded</w:t>
+      </w:r>
+      <w:proofErr w:type="spellEnd"/>
       <w:r>
         <w:rPr>
           <w:rFonts w:ascii="Courier New" w:eastAsia="Courier New" w:hAnsi="Courier New" w:cs="Courier New"/>
@@ -6526,16 +6915,9 @@
           <w:sz w:val="18"/>
           <w:szCs w:val="18"/>
         </w:rPr>
-        <w:t>sample_frames</w:t>
-      </w:r>
-      <w:proofErr w:type="spellEnd"/>
-    </w:p>
-    <w:p>
-      <w:pPr>
-        <w:shd w:val="clear" w:color="auto" w:fill="F0F4F8"/>
-        <w:spacing w:before="40" w:after="40"/>
-        <w:ind w:left="360"/>
-      </w:pPr>
+        <w:t xml:space="preserve"> --</w:t>
+      </w:r>
+      <w:proofErr w:type="spellStart"/>
       <w:r>
         <w:rPr>
           <w:rFonts w:ascii="Courier New" w:eastAsia="Courier New" w:hAnsi="Courier New" w:cs="Courier New"/>
@@ -6543,9 +6925,9 @@
           <w:sz w:val="18"/>
           <w:szCs w:val="18"/>
         </w:rPr>
-        <w:t xml:space="preserve">python run.py </w:t>
-      </w:r>
-      <w:proofErr w:type="spellStart"/>
+        <w:t>ref</w:t>
+      </w:r>
+      <w:proofErr w:type="spellEnd"/>
       <w:r>
         <w:rPr>
           <w:rFonts w:ascii="Courier New" w:eastAsia="Courier New" w:hAnsi="Courier New" w:cs="Courier New"/>
@@ -6553,9 +6935,9 @@
           <w:sz w:val="18"/>
           <w:szCs w:val="18"/>
         </w:rPr>
-        <w:t>viz</w:t>
-      </w:r>
-      <w:proofErr w:type="spellEnd"/>
+        <w:t xml:space="preserve"> </w:t>
+      </w:r>
+      <w:proofErr w:type="spellStart"/>
       <w:r>
         <w:rPr>
           <w:rFonts w:ascii="Courier New" w:eastAsia="Courier New" w:hAnsi="Courier New" w:cs="Courier New"/>
@@ -6563,9 +6945,17 @@
           <w:sz w:val="18"/>
           <w:szCs w:val="18"/>
         </w:rPr>
-        <w:t xml:space="preserve">    </w:t>
-      </w:r>
-      <w:proofErr w:type="spellStart"/>
+        <w:t>sample_frames</w:t>
+      </w:r>
+      <w:proofErr w:type="spellEnd"/>
+    </w:p>
+    <w:p>
+      <w:pPr>
+        <w:shd w:val="clear" w:color="auto" w:fill="F0F4F8"/>
+        <w:spacing w:before="40" w:after="40"/>
+        <w:ind w:left="360"/>
+      </w:pPr>
+      <w:proofErr w:type="gramStart"/>
       <w:r>
         <w:rPr>
           <w:rFonts w:ascii="Courier New" w:eastAsia="Courier New" w:hAnsi="Courier New" w:cs="Courier New"/>
@@ -6573,9 +6963,9 @@
           <w:sz w:val="18"/>
           <w:szCs w:val="18"/>
         </w:rPr>
-        <w:t>sample_frames</w:t>
-      </w:r>
-      <w:proofErr w:type="spellEnd"/>
+        <w:t>python</w:t>
+      </w:r>
+      <w:proofErr w:type="gramEnd"/>
       <w:r>
         <w:rPr>
           <w:rFonts w:ascii="Courier New" w:eastAsia="Courier New" w:hAnsi="Courier New" w:cs="Courier New"/>
@@ -6583,7 +6973,7 @@
           <w:sz w:val="18"/>
           <w:szCs w:val="18"/>
         </w:rPr>
-        <w:t xml:space="preserve"> </w:t>
+        <w:t xml:space="preserve"> run.py </w:t>
       </w:r>
       <w:proofErr w:type="spellStart"/>
       <w:r>
@@ -6593,7 +6983,7 @@
           <w:sz w:val="18"/>
           <w:szCs w:val="18"/>
         </w:rPr>
-        <w:t>video.bin</w:t>
+        <w:t>viz</w:t>
       </w:r>
       <w:proofErr w:type="spellEnd"/>
       <w:r>
@@ -6603,15 +6993,9 @@
           <w:sz w:val="18"/>
           <w:szCs w:val="18"/>
         </w:rPr>
-        <w:t xml:space="preserve"> -o pipeline.png</w:t>
-      </w:r>
-    </w:p>
-    <w:p>
-      <w:pPr>
-        <w:shd w:val="clear" w:color="auto" w:fill="F0F4F8"/>
-        <w:spacing w:before="40" w:after="40"/>
-        <w:ind w:left="360"/>
-      </w:pPr>
+        <w:t xml:space="preserve">    </w:t>
+      </w:r>
+      <w:proofErr w:type="spellStart"/>
       <w:r>
         <w:rPr>
           <w:rFonts w:ascii="Courier New" w:eastAsia="Courier New" w:hAnsi="Courier New" w:cs="Courier New"/>
@@ -6619,9 +7003,9 @@
           <w:sz w:val="18"/>
           <w:szCs w:val="18"/>
         </w:rPr>
-        <w:t xml:space="preserve">python run.py </w:t>
-      </w:r>
-      <w:proofErr w:type="spellStart"/>
+        <w:t>sample_frames</w:t>
+      </w:r>
+      <w:proofErr w:type="spellEnd"/>
       <w:r>
         <w:rPr>
           <w:rFonts w:ascii="Courier New" w:eastAsia="Courier New" w:hAnsi="Courier New" w:cs="Courier New"/>
@@ -6629,9 +7013,9 @@
           <w:sz w:val="18"/>
           <w:szCs w:val="18"/>
         </w:rPr>
-        <w:t>sweep</w:t>
-      </w:r>
-      <w:proofErr w:type="spellEnd"/>
+        <w:t xml:space="preserve"> </w:t>
+      </w:r>
+      <w:proofErr w:type="spellStart"/>
       <w:r>
         <w:rPr>
           <w:rFonts w:ascii="Courier New" w:eastAsia="Courier New" w:hAnsi="Courier New" w:cs="Courier New"/>
@@ -6639,9 +7023,9 @@
           <w:sz w:val="18"/>
           <w:szCs w:val="18"/>
         </w:rPr>
-        <w:t xml:space="preserve">  </w:t>
-      </w:r>
-      <w:proofErr w:type="spellStart"/>
+        <w:t>video.bin</w:t>
+      </w:r>
+      <w:proofErr w:type="spellEnd"/>
       <w:r>
         <w:rPr>
           <w:rFonts w:ascii="Courier New" w:eastAsia="Courier New" w:hAnsi="Courier New" w:cs="Courier New"/>
@@ -6649,7 +7033,75 @@
           <w:sz w:val="18"/>
           <w:szCs w:val="18"/>
         </w:rPr>
-        <w:t>sample_frames</w:t>
+        <w:t xml:space="preserve"> -o pipeline.png</w:t>
+      </w:r>
+    </w:p>
+    <w:p>
+      <w:pPr>
+        <w:shd w:val="clear" w:color="auto" w:fill="F0F4F8"/>
+        <w:spacing w:before="40" w:after="40"/>
+        <w:ind w:left="360"/>
+      </w:pPr>
+      <w:proofErr w:type="gramStart"/>
+      <w:r>
+        <w:rPr>
+          <w:rFonts w:ascii="Courier New" w:eastAsia="Courier New" w:hAnsi="Courier New" w:cs="Courier New"/>
+          <w:color w:val="1A1A2E"/>
+          <w:sz w:val="18"/>
+          <w:szCs w:val="18"/>
+        </w:rPr>
+        <w:t>python</w:t>
+      </w:r>
+      <w:proofErr w:type="gramEnd"/>
+      <w:r>
+        <w:rPr>
+          <w:rFonts w:ascii="Courier New" w:eastAsia="Courier New" w:hAnsi="Courier New" w:cs="Courier New"/>
+          <w:color w:val="1A1A2E"/>
+          <w:sz w:val="18"/>
+          <w:szCs w:val="18"/>
+        </w:rPr>
+        <w:t xml:space="preserve"> run.py </w:t>
+      </w:r>
+      <w:proofErr w:type="spellStart"/>
+      <w:proofErr w:type="gramStart"/>
+      <w:r>
+        <w:rPr>
+          <w:rFonts w:ascii="Courier New" w:eastAsia="Courier New" w:hAnsi="Courier New" w:cs="Courier New"/>
+          <w:color w:val="1A1A2E"/>
+          <w:sz w:val="18"/>
+          <w:szCs w:val="18"/>
+        </w:rPr>
+        <w:t>sweep</w:t>
+      </w:r>
+      <w:proofErr w:type="spellEnd"/>
+      <w:r>
+        <w:rPr>
+          <w:rFonts w:ascii="Courier New" w:eastAsia="Courier New" w:hAnsi="Courier New" w:cs="Courier New"/>
+          <w:color w:val="1A1A2E"/>
+          <w:sz w:val="18"/>
+          <w:szCs w:val="18"/>
+        </w:rPr>
+        <w:t xml:space="preserve">  </w:t>
+      </w:r>
+      <w:proofErr w:type="spellStart"/>
+      <w:r>
+        <w:rPr>
+          <w:rFonts w:ascii="Courier New" w:eastAsia="Courier New" w:hAnsi="Courier New" w:cs="Courier New"/>
+          <w:color w:val="1A1A2E"/>
+          <w:sz w:val="18"/>
+          <w:szCs w:val="18"/>
+        </w:rPr>
+        <w:t>sample</w:t>
+      </w:r>
+      <w:proofErr w:type="gramEnd"/>
+      <w:r>
+        <w:rPr>
+          <w:rFonts w:ascii="Courier New" w:eastAsia="Courier New" w:hAnsi="Courier New" w:cs="Courier New"/>
+          <w:color w:val="1A1A2E"/>
+          <w:sz w:val="18"/>
+          <w:szCs w:val="18"/>
+        </w:rPr>
+        <w:t>_frames</w:t>
       </w:r>
       <w:proofErr w:type="spellEnd"/>
       <w:r>
@@ -7033,7 +7485,25 @@
         <w:sz w:val="18"/>
         <w:szCs w:val="18"/>
       </w:rPr>
-      <w:t xml:space="preserve">Guenif Rania  |  Ouadi Sofia   —   Page </w:t>
+      <w:t xml:space="preserve">Guenif </w:t>
+    </w:r>
+    <w:proofErr w:type="gramStart"/>
+    <w:r>
+      <w:rPr>
+        <w:color w:val="888888"/>
+        <w:sz w:val="18"/>
+        <w:szCs w:val="18"/>
+      </w:rPr>
+      <w:t>Rania  |</w:t>
+    </w:r>
+    <w:proofErr w:type="gramEnd"/>
+    <w:r>
+      <w:rPr>
+        <w:color w:val="888888"/>
+        <w:sz w:val="18"/>
+        <w:szCs w:val="18"/>
+      </w:rPr>
+      <w:t xml:space="preserve">  Ouadi Sofia   —   Page </w:t>
     </w:r>
     <w:r>
       <w:rPr>
@@ -7132,7 +7602,25 @@
         <w:sz w:val="18"/>
         <w:szCs w:val="18"/>
       </w:rPr>
-      <w:t xml:space="preserve"> — Pipeline MPEG-4  |  USTHB 2025-2026</w:t>
+      <w:t xml:space="preserve"> — Pipeline MPEG-</w:t>
+    </w:r>
+    <w:proofErr w:type="gramStart"/>
+    <w:r>
+      <w:rPr>
+        <w:color w:val="888888"/>
+        <w:sz w:val="18"/>
+        <w:szCs w:val="18"/>
+      </w:rPr>
+      <w:t>4  |</w:t>
+    </w:r>
+    <w:proofErr w:type="gramEnd"/>
+    <w:r>
+      <w:rPr>
+        <w:color w:val="888888"/>
+        <w:sz w:val="18"/>
+        <w:szCs w:val="18"/>
+      </w:rPr>
+      <w:t xml:space="preserve">  USTHB 2025-2026</w:t>
     </w:r>
   </w:p>
 </w:hdr>
@@ -7227,6 +7715,92 @@
     </w:lvl>
   </w:abstractNum>
   <w:abstractNum w:abstractNumId="1" w15:restartNumberingAfterBreak="0">
+    <w:nsid w:val="5D8629AC"/>
+    <w:multiLevelType w:val="hybridMultilevel"/>
+    <w:tmpl w:val="C0D8BA6E"/>
+    <w:lvl w:ilvl="0" w:tplc="040C000F">
+      <w:start w:val="1"/>
+      <w:numFmt w:val="decimal"/>
+      <w:lvlText w:val="%1."/>
+      <w:lvlJc w:val="left"/>
+      <w:pPr>
+        <w:ind w:left="720" w:hanging="360"/>
+      </w:pPr>
+    </w:lvl>
+    <w:lvl w:ilvl="1" w:tplc="040C0019" w:tentative="1">
+      <w:start w:val="1"/>
+      <w:numFmt w:val="lowerLetter"/>
+      <w:lvlText w:val="%2."/>
+      <w:lvlJc w:val="left"/>
+      <w:pPr>
+        <w:ind w:left="1440" w:hanging="360"/>
+      </w:pPr>
+    </w:lvl>
+    <w:lvl w:ilvl="2" w:tplc="040C001B" w:tentative="1">
+      <w:start w:val="1"/>
+      <w:numFmt w:val="lowerRoman"/>
+      <w:lvlText w:val="%3."/>
+      <w:lvlJc w:val="right"/>
+      <w:pPr>
+        <w:ind w:left="2160" w:hanging="180"/>
+      </w:pPr>
+    </w:lvl>
+    <w:lvl w:ilvl="3" w:tplc="040C000F" w:tentative="1">
+      <w:start w:val="1"/>
+      <w:numFmt w:val="decimal"/>
+      <w:lvlText w:val="%4."/>
+      <w:lvlJc w:val="left"/>
+      <w:pPr>
+        <w:ind w:left="2880" w:hanging="360"/>
+      </w:pPr>
+    </w:lvl>
+    <w:lvl w:ilvl="4" w:tplc="040C0019" w:tentative="1">
+      <w:start w:val="1"/>
+      <w:numFmt w:val="lowerLetter"/>
+      <w:lvlText w:val="%5."/>
+      <w:lvlJc w:val="left"/>
+      <w:pPr>
+        <w:ind w:left="3600" w:hanging="360"/>
+      </w:pPr>
+    </w:lvl>
+    <w:lvl w:ilvl="5" w:tplc="040C001B" w:tentative="1">
+      <w:start w:val="1"/>
+      <w:numFmt w:val="lowerRoman"/>
+      <w:lvlText w:val="%6."/>
+      <w:lvlJc w:val="right"/>
+      <w:pPr>
+        <w:ind w:left="4320" w:hanging="180"/>
+      </w:pPr>
+    </w:lvl>
+    <w:lvl w:ilvl="6" w:tplc="040C000F" w:tentative="1">
+      <w:start w:val="1"/>
+      <w:numFmt w:val="decimal"/>
+      <w:lvlText w:val="%7."/>
+      <w:lvlJc w:val="left"/>
+      <w:pPr>
+        <w:ind w:left="5040" w:hanging="360"/>
+      </w:pPr>
+    </w:lvl>
+    <w:lvl w:ilvl="7" w:tplc="040C0019" w:tentative="1">
+      <w:start w:val="1"/>
+      <w:numFmt w:val="lowerLetter"/>
+      <w:lvlText w:val="%8."/>
+      <w:lvlJc w:val="left"/>
+      <w:pPr>
+        <w:ind w:left="5760" w:hanging="360"/>
+      </w:pPr>
+    </w:lvl>
+    <w:lvl w:ilvl="8" w:tplc="040C001B" w:tentative="1">
+      <w:start w:val="1"/>
+      <w:numFmt w:val="lowerRoman"/>
+      <w:lvlText w:val="%9."/>
+      <w:lvlJc w:val="right"/>
+      <w:pPr>
+        <w:ind w:left="6480" w:hanging="180"/>
+      </w:pPr>
+    </w:lvl>
+  </w:abstractNum>
+  <w:abstractNum w:abstractNumId="2" w15:restartNumberingAfterBreak="0">
     <w:nsid w:val="665B09A6"/>
     <w:multiLevelType w:val="hybridMultilevel"/>
     <w:tmpl w:val="A87E6D90"/>
@@ -7287,10 +7861,13 @@
     </w:lvlOverride>
   </w:num>
   <w:num w:numId="2" w16cid:durableId="1115293179">
-    <w:abstractNumId w:val="1"/>
+    <w:abstractNumId w:val="2"/>
     <w:lvlOverride w:ilvl="0">
       <w:startOverride w:val="1"/>
     </w:lvlOverride>
+  </w:num>
+  <w:num w:numId="3" w16cid:durableId="1997608039">
+    <w:abstractNumId w:val="1"/>
   </w:num>
 </w:numbering>
 </file>
@@ -7709,6 +8286,7 @@
   </w:style>
   <w:style w:type="paragraph" w:styleId="Titre2">
     <w:name w:val="heading 2"/>
+    <w:link w:val="Titre2Car"/>
     <w:uiPriority w:val="9"/>
     <w:unhideWhenUsed/>
     <w:qFormat/>
@@ -7917,6 +8495,20 @@
     <w:rsid w:val="00303FFE"/>
     <w:rPr>
       <w:rFonts w:asciiTheme="minorHAnsi" w:eastAsiaTheme="minorEastAsia" w:hAnsiTheme="minorHAnsi" w:cstheme="minorBidi"/>
+    </w:rPr>
+  </w:style>
+  <w:style w:type="character" w:customStyle="1" w:styleId="Titre2Car">
+    <w:name w:val="Titre 2 Car"/>
+    <w:basedOn w:val="Policepardfaut"/>
+    <w:link w:val="Titre2"/>
+    <w:uiPriority w:val="9"/>
+    <w:rsid w:val="0085209C"/>
+    <w:rPr>
+      <w:b/>
+      <w:bCs/>
+      <w:color w:val="16213E"/>
+      <w:sz w:val="24"/>
+      <w:szCs w:val="24"/>
     </w:rPr>
   </w:style>
 </w:styles>

</xml_diff>